<commit_message>
Save to Google Sheet via Google Form (required); show sheet data; class setup link; dashboard 3F4D band
Co-Authored-By: Claude Sonnet 5.5 <noreply@anthropic.com>
Claude-Session: https://claude.ai/code/session_01M3YQQoTMjJVd24svSbk5Ra
</commit_message>
<xml_diff>
--- a/manual/ATI_Monitor_App_Manual_EN.docx
+++ b/manual/ATI_Monitor_App_Manual_EN.docx
@@ -32,7 +32,7 @@
           <w:sz w:val="22"/>
           <w:szCs w:val="22"/>
         </w:rPr>
-        <w:t xml:space="preserve">Entry, automatic calculation, shared Google Sheet and comparison with other ATIs</w:t>
+        <w:t xml:space="preserve">Entry, automatic calculation, automatic saving to the Google Sheet and comparison with other ATIs</w:t>
       </w:r>
     </w:p>
     <w:p>
@@ -60,7 +60,7 @@
         <w:rPr>
           <w:rFonts w:ascii="Arial" w:cs="Nirmala UI" w:eastAsia="Yu Gothic" w:hAnsi="Arial"/>
         </w:rPr>
-        <w:t xml:space="preserve">ATI Water Monitor is a smartphone app for recording the water level of the FP (Farmers' Practice) plot and the 3F4D+MD plot. You can enter data without internet. The numbers you enter are pasted into a shared Google Sheet prepared by the teacher, and you can compare your ATI with the other ATIs in graphs. No script and no password are needed.</w:t>
+        <w:t xml:space="preserve">ATI Water Monitor is a smartphone app for recording the water level of the FP (Farmers' Practice) plot and the 3F4D+MD plot. When you save, the data are sent automatically to the shared Google Sheet prepared by the teacher, through a Google Form. The dashboard shows the data kept in the sheet, not only the data on the phone. You can compare your ATI with the other ATIs in graphs.</w:t>
       </w:r>
     </w:p>
     <w:tbl>
@@ -221,7 +221,7 @@
                 <w:sz w:val="19"/>
                 <w:szCs w:val="19"/>
               </w:rPr>
-              <w:t xml:space="preserve">2. Paste</w:t>
+              <w:t xml:space="preserve">2. Sent automatically</w:t>
             </w:r>
           </w:p>
         </w:tc>
@@ -247,7 +247,7 @@
                 <w:sz w:val="19"/>
                 <w:szCs w:val="19"/>
               </w:rPr>
-              <w:t xml:space="preserve">Press "Copy my data" and paste the numbers below the last row of the tab "Data" in the shared sheet.</w:t>
+              <w:t xml:space="preserve">When you save (for example "Save entry"), the data are sent to the shared sheet a few seconds later. No pasting is needed.</w:t>
             </w:r>
           </w:p>
         </w:tc>
@@ -278,7 +278,7 @@
                 <w:sz w:val="19"/>
                 <w:szCs w:val="19"/>
               </w:rPr>
-              <w:t xml:space="preserve">3. Compare</w:t>
+              <w:t xml:space="preserve">3. Show and compare</w:t>
             </w:r>
           </w:p>
         </w:tc>
@@ -304,12 +304,23 @@
                 <w:sz w:val="19"/>
                 <w:szCs w:val="19"/>
               </w:rPr>
-              <w:t xml:space="preserve">Enter the "compare link" in the Compare tab and load it: your ATI is shown against the other ATIs in the sheet.</w:t>
+              <w:t xml:space="preserve">The dashboard and the Compare tab show the data in the sheet. You can compare your ATI with the other ATIs in graphs.</w:t>
             </w:r>
           </w:p>
         </w:tc>
       </w:tr>
     </w:tbl>
+    <w:p>
+      <w:pPr>
+        <w:spacing w:after="100" w:line="300"/>
+      </w:pPr>
+      <w:r>
+        <w:rPr>
+          <w:rFonts w:ascii="Arial" w:cs="Nirmala UI" w:eastAsia="Yu Gothic" w:hAnsi="Arial"/>
+        </w:rPr>
+        <w:t xml:space="preserve">Saving to the Google Sheet is required. "Save entry" cannot be pressed until the app is connected to the sheet.</w:t>
+      </w:r>
+    </w:p>
     <w:p>
       <w:pPr>
         <w:pStyle w:val="Heading1"/>
@@ -324,7 +335,7 @@
           <w:sz w:val="30"/>
           <w:szCs w:val="30"/>
         </w:rPr>
-        <w:t xml:space="preserve">2. Teacher setup (shared Google Sheet)</w:t>
+        <w:t xml:space="preserve">2. Teacher setup (Google Form and shared sheet)</w:t>
       </w:r>
     </w:p>
     <w:p>
@@ -335,23 +346,7 @@
         <w:rPr>
           <w:rFonts w:ascii="Arial" w:cs="Nirmala UI" w:eastAsia="Yu Gothic" w:hAnsi="Arial"/>
         </w:rPr>
-        <w:t xml:space="preserve">The administrator (for example a teacher) does this once. You do not need one sheet per ATI: all ATIs that want to compare use the same sheet.</w:t>
-      </w:r>
-    </w:p>
-    <w:p>
-      <w:pPr>
-        <w:pStyle w:val="ListParagraph"/>
-        <w:numPr>
-          <w:ilvl w:val="0"/>
-          <w:numId w:val="2"/>
-        </w:numPr>
-        <w:spacing w:after="80" w:line="290"/>
-      </w:pPr>
-      <w:r>
-        <w:rPr>
-          <w:rFonts w:ascii="Arial" w:cs="Nirmala UI" w:eastAsia="Yu Gothic" w:hAnsi="Arial"/>
-        </w:rPr>
-        <w:t xml:space="preserve">Upload the template Excel file ATI_Monitor_Shared_TEMPLATE.xlsx to Google Drive, open it and choose "File &gt; Save as Google Sheets".</w:t>
+        <w:t xml:space="preserve">The administrator (for example a teacher) does this once. All ATIs that want to compare use the same form and the same sheet.</w:t>
       </w:r>
     </w:p>
     <w:p>
@@ -369,13 +364,29 @@
           <w:b/>
           <w:bCs/>
         </w:rPr>
-        <w:t xml:space="preserve">Sharing link (for entering)</w:t>
-      </w:r>
-      <w:r>
-        <w:rPr>
-          <w:rFonts w:ascii="Arial" w:cs="Nirmala UI" w:eastAsia="Yu Gothic" w:hAnsi="Arial"/>
-        </w:rPr>
-        <w:t xml:space="preserve">: click "Share", set "Anyone with the link" to "Editor", and copy the link. Students paste their data here.</w:t>
+        <w:t xml:space="preserve">Make the form</w:t>
+      </w:r>
+      <w:r>
+        <w:rPr>
+          <w:rFonts w:ascii="Arial" w:cs="Nirmala UI" w:eastAsia="Yu Gothic" w:hAnsi="Arial"/>
+        </w:rPr>
+        <w:t xml:space="preserve">: create a new Google Form with these four questions, in this order, with exactly these names: ATI (short answer), Updated (short answer), Summary (short answer), Data (paragraph). Keep the names exactly, including capital letters. Do not make them "Required".</w:t>
+      </w:r>
+    </w:p>
+    <w:p>
+      <w:pPr>
+        <w:pStyle w:val="ListParagraph"/>
+        <w:numPr>
+          <w:ilvl w:val="0"/>
+          <w:numId w:val="2"/>
+        </w:numPr>
+        <w:spacing w:after="80" w:line="290"/>
+      </w:pPr>
+      <w:r>
+        <w:rPr>
+          <w:rFonts w:ascii="Arial" w:cs="Nirmala UI" w:eastAsia="Yu Gothic" w:hAnsi="Arial"/>
+        </w:rPr>
+        <w:t xml:space="preserve">In the form settings, turn OFF "Require sign-in", "Limit to 1 response" and "Collect email addresses" (so that students can send without signing in). Keep the form open for responses.</w:t>
       </w:r>
     </w:p>
     <w:p>
@@ -393,13 +404,13 @@
           <w:b/>
           <w:bCs/>
         </w:rPr>
-        <w:t xml:space="preserve">Compare link (for reading)</w:t>
-      </w:r>
-      <w:r>
-        <w:rPr>
-          <w:rFonts w:ascii="Arial" w:cs="Nirmala UI" w:eastAsia="Yu Gothic" w:hAnsi="Arial"/>
-        </w:rPr>
-        <w:t xml:space="preserve">: open "File &gt; Share &gt; Publish to web". Under "Link", choose the sheet "Data" instead of "Entire document", choose the format "Comma-separated values (.csv)" and press "Publish". Copy the link shown.</w:t>
+        <w:t xml:space="preserve">Form link</w:t>
+      </w:r>
+      <w:r>
+        <w:rPr>
+          <w:rFonts w:ascii="Arial" w:cs="Nirmala UI" w:eastAsia="Yu Gothic" w:hAnsi="Arial"/>
+        </w:rPr>
+        <w:t xml:space="preserve">: open the "︙" menu at the top right &gt; "Get pre-filled link". In the four questions, type ATI, UPDATED, SUMMARY and DATA (the question names in capital letters). Press "Get link" &gt; "Copy link".</w:t>
       </w:r>
     </w:p>
     <w:p>
@@ -414,8 +425,64 @@
       <w:r>
         <w:rPr>
           <w:rFonts w:ascii="Arial" w:cs="Nirmala UI" w:eastAsia="Yu Gothic" w:hAnsi="Arial"/>
-        </w:rPr>
-        <w:t xml:space="preserve">Give the students three things: (1) the app address, (2) the sharing link, (3) the compare link.</w:t>
+          <w:b/>
+          <w:bCs/>
+        </w:rPr>
+        <w:t xml:space="preserve">Make the sheet</w:t>
+      </w:r>
+      <w:r>
+        <w:rPr>
+          <w:rFonts w:ascii="Arial" w:cs="Nirmala UI" w:eastAsia="Yu Gothic" w:hAnsi="Arial"/>
+        </w:rPr>
+        <w:t xml:space="preserve">: in the form, open the "Responses" tab and press "Link to Sheets" to create the response sheet.</w:t>
+      </w:r>
+    </w:p>
+    <w:p>
+      <w:pPr>
+        <w:pStyle w:val="ListParagraph"/>
+        <w:numPr>
+          <w:ilvl w:val="0"/>
+          <w:numId w:val="2"/>
+        </w:numPr>
+        <w:spacing w:after="80" w:line="290"/>
+      </w:pPr>
+      <w:r>
+        <w:rPr>
+          <w:rFonts w:ascii="Arial" w:cs="Nirmala UI" w:eastAsia="Yu Gothic" w:hAnsi="Arial"/>
+          <w:b/>
+          <w:bCs/>
+        </w:rPr>
+        <w:t xml:space="preserve">Compare link</w:t>
+      </w:r>
+      <w:r>
+        <w:rPr>
+          <w:rFonts w:ascii="Arial" w:cs="Nirmala UI" w:eastAsia="Yu Gothic" w:hAnsi="Arial"/>
+        </w:rPr>
+        <w:t xml:space="preserve">: in that sheet, open "File &gt; Share &gt; Publish to web". Choose the response tab ("Form Responses 1") instead of "Entire document", choose the format "Comma-separated values (.csv)" and press "Publish". Copy the link shown.</w:t>
+      </w:r>
+    </w:p>
+    <w:p>
+      <w:pPr>
+        <w:pStyle w:val="ListParagraph"/>
+        <w:numPr>
+          <w:ilvl w:val="0"/>
+          <w:numId w:val="2"/>
+        </w:numPr>
+        <w:spacing w:after="80" w:line="290"/>
+      </w:pPr>
+      <w:r>
+        <w:rPr>
+          <w:rFonts w:ascii="Arial" w:cs="Nirmala UI" w:eastAsia="Yu Gothic" w:hAnsi="Arial"/>
+          <w:b/>
+          <w:bCs/>
+        </w:rPr>
+        <w:t xml:space="preserve">Connect the app</w:t>
+      </w:r>
+      <w:r>
+        <w:rPr>
+          <w:rFonts w:ascii="Arial" w:cs="Nirmala UI" w:eastAsia="Yu Gothic" w:hAnsi="Arial"/>
+        </w:rPr>
+        <w:t xml:space="preserve">: in the app, open Share &gt; Google Sheet connection and paste the form link and the compare link. Press "Create class setup link" to make one link, and send that link to the students. When a student opens it, both links are filled in automatically.</w:t>
       </w:r>
     </w:p>
     <w:tbl>
@@ -467,12 +534,31 @@
               <w:rPr>
                 <w:rFonts w:ascii="Arial" w:cs="Nirmala UI" w:eastAsia="Yu Gothic" w:hAnsi="Arial"/>
               </w:rPr>
-              <w:t xml:space="preserve">Anyone who knows the sharing link can edit or delete the sheet. If rows are deleted by mistake, restore them with "File &gt; Version history". Anyone who knows the compare link can read the data (water level, irrigation and so on; no farmer names). To stop publishing, press "Stop publishing" on the "Publish to web" screen.</w:t>
+              <w:t xml:space="preserve">Anyone who knows the form link can send data, so give it to the students only. Anyone who knows the compare link can read the data (water level, irrigation and so on; no farmer names). To stop publishing, press "Stop publishing" on the "Publish to web" screen. If rows are deleted by mistake, restore them with "File &gt; Version history".</w:t>
             </w:r>
           </w:p>
         </w:tc>
       </w:tr>
     </w:tbl>
+    <w:p>
+      <w:pPr>
+        <w:spacing w:after="100" w:line="300"/>
+      </w:pPr>
+      <w:r>
+        <w:rPr>
+          <w:rFonts w:ascii="Arial" w:cs="Nirmala UI" w:eastAsia="Yu Gothic" w:hAnsi="Arial"/>
+          <w:b/>
+          <w:bCs/>
+        </w:rPr>
+        <w:t xml:space="preserve">How the sheet grows: </w:t>
+      </w:r>
+      <w:r>
+        <w:rPr>
+          <w:rFonts w:ascii="Arial" w:cs="Nirmala UI" w:eastAsia="Yu Gothic" w:hAnsi="Arial"/>
+        </w:rPr>
+        <w:t xml:space="preserve">Every save adds one row (about 2-3 KB). Only the newest row of each ATI is used. You may delete old rows from time to time (never the newest row of an ATI). If the sheet becomes large, you can make another tab "Latest": write ATI, Updated, Summary, Data in A1:D1, put =SORTN(SORT('Form Responses 1'!B2:E,2,FALSE),9999,2,1,TRUE) in A2, and publish that tab instead. (This formula is not verified. Try it first.)</w:t>
+      </w:r>
+    </w:p>
     <w:p>
       <w:pPr>
         <w:pStyle w:val="Heading1"/>
@@ -520,7 +606,7 @@
         <w:rPr>
           <w:rFonts w:ascii="Arial" w:cs="Nirmala UI" w:eastAsia="Yu Gothic" w:hAnsi="Arial"/>
         </w:rPr>
-        <w:t xml:space="preserve">Open the app. On a phone, open it in Chrome and choose "Add to Home screen" to start it from an icon.</w:t>
+        <w:t xml:space="preserve">Open the "class setup link" from the teacher in Chrome on the phone. This connects the app to the shared sheet. In Chrome, choose "Add to Home screen" to start the app from an icon.</w:t>
       </w:r>
     </w:p>
     <w:p>
@@ -544,7 +630,7 @@
         <w:rPr>
           <w:rFonts w:ascii="Arial" w:cs="Nirmala UI" w:eastAsia="Yu Gothic" w:hAnsi="Arial"/>
         </w:rPr>
-        <w:t xml:space="preserve"> tab: enter ATI name*, place*, sowing date*, seedling age at transplanting*, and TP and b* of FP and 3F4D+MD (* = required). While a required item is empty, "Save entry" in the Entry tab cannot be pressed.</w:t>
+        <w:t xml:space="preserve"> tab: enter ATI name*, place*, sowing date*, seedling age at transplanting*, and TP and b* of FP and 3F4D+MD (* = required). While a required item is empty, or the app is not connected to the sheet, "Save entry" in the Entry tab cannot be pressed.</w:t>
       </w:r>
     </w:p>
     <w:p>
@@ -569,30 +655,6 @@
           <w:rFonts w:ascii="Arial" w:cs="Nirmala UI" w:eastAsia="Yu Gothic" w:hAnsi="Arial"/>
         </w:rPr>
         <w:t xml:space="preserve"> tab: planned dates appear automatically. Enter the date you actually did the work in "Actual".</w:t>
-      </w:r>
-    </w:p>
-    <w:p>
-      <w:pPr>
-        <w:pStyle w:val="ListParagraph"/>
-        <w:numPr>
-          <w:ilvl w:val="0"/>
-          <w:numId w:val="3"/>
-        </w:numPr>
-        <w:spacing w:after="60" w:line="290"/>
-      </w:pPr>
-      <w:r>
-        <w:rPr>
-          <w:rFonts w:ascii="Arial" w:cs="Nirmala UI" w:eastAsia="Yu Gothic" w:hAnsi="Arial"/>
-          <w:b/>
-          <w:bCs/>
-        </w:rPr>
-        <w:t xml:space="preserve">Share</w:t>
-      </w:r>
-      <w:r>
-        <w:rPr>
-          <w:rFonts w:ascii="Arial" w:cs="Nirmala UI" w:eastAsia="Yu Gothic" w:hAnsi="Arial"/>
-        </w:rPr>
-        <w:t xml:space="preserve"> tab &gt; Shared Google Sheet: type the sharing link and the compare link.</w:t>
       </w:r>
     </w:p>
     <w:p>
@@ -744,16 +806,323 @@
       <w:r>
         <w:rPr>
           <w:rFonts w:ascii="Arial" w:cs="Nirmala UI" w:eastAsia="Yu Gothic" w:hAnsi="Arial"/>
-          <w:b/>
-          <w:bCs/>
-        </w:rPr>
-        <w:t xml:space="preserve">Share &gt; Copy my data</w:t>
-      </w:r>
-      <w:r>
-        <w:rPr>
-          <w:rFonts w:ascii="Arial" w:cs="Nirmala UI" w:eastAsia="Yu Gothic" w:hAnsi="Arial"/>
-        </w:rPr>
-        <w:t xml:space="preserve">. Open the shared sheet with the "Open shared sheet" button, click the first empty cell of column A in the tab "Data" (below the last row) and paste (Ctrl+V; on a phone, long-press and Paste). Do this when you are online.</w:t>
+        </w:rPr>
+        <w:t xml:space="preserve">After saving, the data are sent to the sheet automatically a few seconds later. The line above the dashboard shows the state.</w:t>
+      </w:r>
+    </w:p>
+    <w:tbl>
+      <w:tblPr>
+        <w:tblW w:type="dxa" w:w="9360"/>
+        <w:tblBorders>
+          <w:top w:val="single" w:color="BFC5C9" w:sz="4"/>
+          <w:left w:val="single" w:color="BFC5C9" w:sz="4"/>
+          <w:bottom w:val="single" w:color="BFC5C9" w:sz="4"/>
+          <w:right w:val="single" w:color="BFC5C9" w:sz="4"/>
+          <w:insideH w:val="single" w:color="BFC5C9" w:sz="4"/>
+          <w:insideV w:val="single" w:color="BFC5C9" w:sz="4"/>
+        </w:tblBorders>
+      </w:tblPr>
+      <w:tblGrid>
+        <w:gridCol w:w="3000"/>
+        <w:gridCol w:w="6360"/>
+      </w:tblGrid>
+      <w:tr>
+        <w:trPr>
+          <w:tblHeader/>
+        </w:trPr>
+        <w:tc>
+          <w:tcPr>
+            <w:tcW w:type="dxa" w:w="3000"/>
+            <w:shd w:fill="DCE8EC" w:val="clear"/>
+            <w:tcMar>
+              <w:top w:type="dxa" w:w="60"/>
+              <w:left w:type="dxa" w:w="100"/>
+              <w:bottom w:type="dxa" w:w="60"/>
+              <w:right w:type="dxa" w:w="100"/>
+            </w:tcMar>
+          </w:tcPr>
+          <w:p>
+            <w:pPr>
+              <w:spacing w:after="20" w:line="270"/>
+            </w:pPr>
+            <w:r>
+              <w:rPr>
+                <w:rFonts w:ascii="Arial" w:cs="Nirmala UI" w:eastAsia="Yu Gothic" w:hAnsi="Arial"/>
+                <w:b/>
+                <w:bCs/>
+                <w:sz w:val="19"/>
+                <w:szCs w:val="19"/>
+              </w:rPr>
+              <w:t xml:space="preserve">Message</w:t>
+            </w:r>
+          </w:p>
+        </w:tc>
+        <w:tc>
+          <w:tcPr>
+            <w:tcW w:type="dxa" w:w="6360"/>
+            <w:shd w:fill="DCE8EC" w:val="clear"/>
+            <w:tcMar>
+              <w:top w:type="dxa" w:w="60"/>
+              <w:left w:type="dxa" w:w="100"/>
+              <w:bottom w:type="dxa" w:w="60"/>
+              <w:right w:type="dxa" w:w="100"/>
+            </w:tcMar>
+          </w:tcPr>
+          <w:p>
+            <w:pPr>
+              <w:spacing w:after="20" w:line="270"/>
+            </w:pPr>
+            <w:r>
+              <w:rPr>
+                <w:rFonts w:ascii="Arial" w:cs="Nirmala UI" w:eastAsia="Yu Gothic" w:hAnsi="Arial"/>
+                <w:b/>
+                <w:bCs/>
+                <w:sz w:val="19"/>
+                <w:szCs w:val="19"/>
+              </w:rPr>
+              <w:t xml:space="preserve">Meaning and what to do</w:t>
+            </w:r>
+          </w:p>
+        </w:tc>
+      </w:tr>
+      <w:tr>
+        <w:trPr>
+          <w:tblHeader w:val="false"/>
+        </w:trPr>
+        <w:tc>
+          <w:tcPr>
+            <w:tcW w:type="dxa" w:w="3000"/>
+            <w:tcMar>
+              <w:top w:type="dxa" w:w="60"/>
+              <w:left w:type="dxa" w:w="100"/>
+              <w:bottom w:type="dxa" w:w="60"/>
+              <w:right w:type="dxa" w:w="100"/>
+            </w:tcMar>
+          </w:tcPr>
+          <w:p>
+            <w:pPr>
+              <w:spacing w:after="20" w:line="270"/>
+            </w:pPr>
+            <w:r>
+              <w:rPr>
+                <w:rFonts w:ascii="Arial" w:cs="Nirmala UI" w:eastAsia="Yu Gothic" w:hAnsi="Arial"/>
+                <w:b w:val="false"/>
+                <w:bCs w:val="false"/>
+                <w:sz w:val="19"/>
+                <w:szCs w:val="19"/>
+              </w:rPr>
+              <w:t xml:space="preserve">Not yet sent</w:t>
+            </w:r>
+          </w:p>
+        </w:tc>
+        <w:tc>
+          <w:tcPr>
+            <w:tcW w:type="dxa" w:w="6360"/>
+            <w:tcMar>
+              <w:top w:type="dxa" w:w="60"/>
+              <w:left w:type="dxa" w:w="100"/>
+              <w:bottom w:type="dxa" w:w="60"/>
+              <w:right w:type="dxa" w:w="100"/>
+            </w:tcMar>
+          </w:tcPr>
+          <w:p>
+            <w:pPr>
+              <w:spacing w:after="20" w:line="270"/>
+            </w:pPr>
+            <w:r>
+              <w:rPr>
+                <w:rFonts w:ascii="Arial" w:cs="Nirmala UI" w:eastAsia="Yu Gothic" w:hAnsi="Arial"/>
+                <w:b w:val="false"/>
+                <w:bCs w:val="false"/>
+                <w:sz w:val="19"/>
+                <w:szCs w:val="19"/>
+              </w:rPr>
+              <w:t xml:space="preserve">Not sent yet. It is sent automatically when the phone is online. You can also press "Send now".</w:t>
+            </w:r>
+          </w:p>
+        </w:tc>
+      </w:tr>
+      <w:tr>
+        <w:trPr>
+          <w:tblHeader w:val="false"/>
+        </w:trPr>
+        <w:tc>
+          <w:tcPr>
+            <w:tcW w:type="dxa" w:w="3000"/>
+            <w:tcMar>
+              <w:top w:type="dxa" w:w="60"/>
+              <w:left w:type="dxa" w:w="100"/>
+              <w:bottom w:type="dxa" w:w="60"/>
+              <w:right w:type="dxa" w:w="100"/>
+            </w:tcMar>
+          </w:tcPr>
+          <w:p>
+            <w:pPr>
+              <w:spacing w:after="20" w:line="270"/>
+            </w:pPr>
+            <w:r>
+              <w:rPr>
+                <w:rFonts w:ascii="Arial" w:cs="Nirmala UI" w:eastAsia="Yu Gothic" w:hAnsi="Arial"/>
+                <w:b w:val="false"/>
+                <w:bCs w:val="false"/>
+                <w:sz w:val="19"/>
+                <w:szCs w:val="19"/>
+              </w:rPr>
+              <w:t xml:space="preserve">Sent. Waiting for the sheet…</w:t>
+            </w:r>
+          </w:p>
+        </w:tc>
+        <w:tc>
+          <w:tcPr>
+            <w:tcW w:type="dxa" w:w="6360"/>
+            <w:tcMar>
+              <w:top w:type="dxa" w:w="60"/>
+              <w:left w:type="dxa" w:w="100"/>
+              <w:bottom w:type="dxa" w:w="60"/>
+              <w:right w:type="dxa" w:w="100"/>
+            </w:tcMar>
+          </w:tcPr>
+          <w:p>
+            <w:pPr>
+              <w:spacing w:after="20" w:line="270"/>
+            </w:pPr>
+            <w:r>
+              <w:rPr>
+                <w:rFonts w:ascii="Arial" w:cs="Nirmala UI" w:eastAsia="Yu Gothic" w:hAnsi="Arial"/>
+                <w:b w:val="false"/>
+                <w:bCs w:val="false"/>
+                <w:sz w:val="19"/>
+                <w:szCs w:val="19"/>
+              </w:rPr>
+              <w:t xml:space="preserve">Sent. The sheet needs a few minutes to show it. Wait.</w:t>
+            </w:r>
+          </w:p>
+        </w:tc>
+      </w:tr>
+      <w:tr>
+        <w:trPr>
+          <w:tblHeader w:val="false"/>
+        </w:trPr>
+        <w:tc>
+          <w:tcPr>
+            <w:tcW w:type="dxa" w:w="3000"/>
+            <w:tcMar>
+              <w:top w:type="dxa" w:w="60"/>
+              <w:left w:type="dxa" w:w="100"/>
+              <w:bottom w:type="dxa" w:w="60"/>
+              <w:right w:type="dxa" w:w="100"/>
+            </w:tcMar>
+          </w:tcPr>
+          <w:p>
+            <w:pPr>
+              <w:spacing w:after="20" w:line="270"/>
+            </w:pPr>
+            <w:r>
+              <w:rPr>
+                <w:rFonts w:ascii="Arial" w:cs="Nirmala UI" w:eastAsia="Yu Gothic" w:hAnsi="Arial"/>
+                <w:b w:val="false"/>
+                <w:bCs w:val="false"/>
+                <w:sz w:val="19"/>
+                <w:szCs w:val="19"/>
+              </w:rPr>
+              <w:t xml:space="preserve">Saved in Google Sheet</w:t>
+            </w:r>
+          </w:p>
+        </w:tc>
+        <w:tc>
+          <w:tcPr>
+            <w:tcW w:type="dxa" w:w="6360"/>
+            <w:tcMar>
+              <w:top w:type="dxa" w:w="60"/>
+              <w:left w:type="dxa" w:w="100"/>
+              <w:bottom w:type="dxa" w:w="60"/>
+              <w:right w:type="dxa" w:w="100"/>
+            </w:tcMar>
+          </w:tcPr>
+          <w:p>
+            <w:pPr>
+              <w:spacing w:after="20" w:line="270"/>
+            </w:pPr>
+            <w:r>
+              <w:rPr>
+                <w:rFonts w:ascii="Arial" w:cs="Nirmala UI" w:eastAsia="Yu Gothic" w:hAnsi="Arial"/>
+                <w:b w:val="false"/>
+                <w:bCs w:val="false"/>
+                <w:sz w:val="19"/>
+                <w:szCs w:val="19"/>
+              </w:rPr>
+              <w:t xml:space="preserve">The sheet has it. This is the normal state.</w:t>
+            </w:r>
+          </w:p>
+        </w:tc>
+      </w:tr>
+      <w:tr>
+        <w:trPr>
+          <w:tblHeader w:val="false"/>
+        </w:trPr>
+        <w:tc>
+          <w:tcPr>
+            <w:tcW w:type="dxa" w:w="3000"/>
+            <w:tcMar>
+              <w:top w:type="dxa" w:w="60"/>
+              <w:left w:type="dxa" w:w="100"/>
+              <w:bottom w:type="dxa" w:w="60"/>
+              <w:right w:type="dxa" w:w="100"/>
+            </w:tcMar>
+          </w:tcPr>
+          <w:p>
+            <w:pPr>
+              <w:spacing w:after="20" w:line="270"/>
+            </w:pPr>
+            <w:r>
+              <w:rPr>
+                <w:rFonts w:ascii="Arial" w:cs="Nirmala UI" w:eastAsia="Yu Gothic" w:hAnsi="Arial"/>
+                <w:b w:val="false"/>
+                <w:bCs w:val="false"/>
+                <w:sz w:val="19"/>
+                <w:szCs w:val="19"/>
+              </w:rPr>
+              <w:t xml:space="preserve">Sent, but the sheet does not show it yet</w:t>
+            </w:r>
+          </w:p>
+        </w:tc>
+        <w:tc>
+          <w:tcPr>
+            <w:tcW w:type="dxa" w:w="6360"/>
+            <w:tcMar>
+              <w:top w:type="dxa" w:w="60"/>
+              <w:left w:type="dxa" w:w="100"/>
+              <w:bottom w:type="dxa" w:w="60"/>
+              <w:right w:type="dxa" w:w="100"/>
+            </w:tcMar>
+          </w:tcPr>
+          <w:p>
+            <w:pPr>
+              <w:spacing w:after="20" w:line="270"/>
+            </w:pPr>
+            <w:r>
+              <w:rPr>
+                <w:rFonts w:ascii="Arial" w:cs="Nirmala UI" w:eastAsia="Yu Gothic" w:hAnsi="Arial"/>
+                <w:b w:val="false"/>
+                <w:bCs w:val="false"/>
+                <w:sz w:val="19"/>
+                <w:szCs w:val="19"/>
+              </w:rPr>
+              <w:t xml:space="preserve">Not in the sheet after 20 minutes. Check the form link and press "Send now".</w:t>
+            </w:r>
+          </w:p>
+        </w:tc>
+      </w:tr>
+    </w:tbl>
+    <w:p>
+      <w:pPr>
+        <w:spacing w:after="100" w:line="300"/>
+      </w:pPr>
+      <w:r>
+        <w:rPr>
+          <w:rFonts w:ascii="Arial" w:cs="Nirmala UI" w:eastAsia="Yu Gothic" w:hAnsi="Arial"/>
+        </w:rPr>
+        <w:t xml:space="preserve">You can enter and save in the field without internet. The data stay on the phone for a while and are sent when the phone is online again.</w:t>
       </w:r>
     </w:p>
     <w:tbl>
@@ -1236,7 +1605,40 @@
         <w:rPr>
           <w:rFonts w:ascii="Arial" w:cs="Nirmala UI" w:eastAsia="Yu Gothic" w:hAnsi="Arial"/>
         </w:rPr>
-        <w:t xml:space="preserve">After correcting, press "Copy my data" again and paste below the last row. Only the newest paste of the same ATI is used for comparison (older pastes are ignored).</w:t>
+        <w:t xml:space="preserve">After a correction the new version is also sent automatically. In the sheet, the newest version of the same ATI is used.</w:t>
+      </w:r>
+    </w:p>
+    <w:p>
+      <w:pPr>
+        <w:pStyle w:val="Heading2"/>
+        <w:spacing w:after="100" w:before="220"/>
+      </w:pPr>
+      <w:r>
+        <w:rPr>
+          <w:rFonts w:ascii="Arial" w:cs="Nirmala UI" w:eastAsia="Yu Gothic" w:hAnsi="Arial"/>
+          <w:b/>
+          <w:bCs/>
+          <w:color w:val="1F4E5F"/>
+          <w:sz w:val="25"/>
+          <w:szCs w:val="25"/>
+        </w:rPr>
+        <w:t xml:space="preserve">3.4 Continuing on a new phone</w:t>
+      </w:r>
+    </w:p>
+    <w:p>
+      <w:pPr>
+        <w:pStyle w:val="ListParagraph"/>
+        <w:numPr>
+          <w:ilvl w:val="0"/>
+          <w:numId w:val="3"/>
+        </w:numPr>
+        <w:spacing w:after="60" w:line="290"/>
+      </w:pPr>
+      <w:r>
+        <w:rPr>
+          <w:rFonts w:ascii="Arial" w:cs="Nirmala UI" w:eastAsia="Yu Gothic" w:hAnsi="Arial"/>
+        </w:rPr>
+        <w:t xml:space="preserve">Open the class setup link. In Share &gt; Restore from the sheet, type the ATI name (exactly as in the sheet) and press "Restore from sheet". The data in the sheet come back to that phone.</w:t>
       </w:r>
     </w:p>
     <w:p>
@@ -1269,7 +1671,7 @@
         <w:rPr>
           <w:rFonts w:ascii="Arial" w:cs="Nirmala UI" w:eastAsia="Yu Gothic" w:hAnsi="Arial"/>
         </w:rPr>
-        <w:t xml:space="preserve">Enter the "compare link" in the Share tab, then press "Load from shared sheet" in the Compare tab to read the other ATIs. Tick the ATIs you want to see.</w:t>
+        <w:t xml:space="preserve">The Compare tab reads all ATIs in the sheet when the app opens. Press "Refresh from sheet" to read again. Tick the ATIs you want to see.</w:t>
       </w:r>
     </w:p>
     <w:p>
@@ -1333,7 +1735,7 @@
         <w:rPr>
           <w:rFonts w:ascii="Arial" w:cs="Nirmala UI" w:eastAsia="Yu Gothic" w:hAnsi="Arial"/>
         </w:rPr>
-        <w:t xml:space="preserve">To see how Compare looks without internet, use "Try with demo data" in Setup (demo ATIs also appear in Compare).</w:t>
+        <w:t xml:space="preserve">To see how Compare looks without connecting to the sheet, use "Try with demo data" in Setup (demo ATIs also appear in Compare). Nothing is sent in the demo.</w:t>
       </w:r>
     </w:p>
     <w:p>
@@ -1374,7 +1776,7 @@
         <w:rPr>
           <w:rFonts w:ascii="Arial" w:cs="Nirmala UI" w:eastAsia="Yu Gothic" w:hAnsi="Arial"/>
         </w:rPr>
-        <w:t xml:space="preserve">"Try with demo data" in Setup opens the app with example data. Nothing is saved. You can try Compare too. Press "Exit demo" at the top to leave.</w:t>
+        <w:t xml:space="preserve">"Try with demo data" in Setup opens the app with example data. Nothing is saved or sent. Press "Exit demo" at the top to leave.</w:t>
       </w:r>
     </w:p>
     <w:p>
@@ -1398,7 +1800,7 @@
         <w:rPr>
           <w:rFonts w:ascii="Arial" w:cs="Nirmala UI" w:eastAsia="Yu Gothic" w:hAnsi="Arial"/>
         </w:rPr>
-        <w:t xml:space="preserve">Data are stored only in the browser of that phone. Use "Export file (JSON)" in Share from time to time. Use it also to move to another phone.</w:t>
+        <w:t xml:space="preserve">The master copy is the sheet. The phone also keeps a copy until it has been sent. You may also use "Export file (JSON)" in Share from time to time.</w:t>
       </w:r>
     </w:p>
     <w:p>
@@ -1422,7 +1824,7 @@
         <w:rPr>
           <w:rFonts w:ascii="Arial" w:cs="Nirmala UI" w:eastAsia="Yu Gothic" w:hAnsi="Arial"/>
         </w:rPr>
-        <w:t xml:space="preserve">"Create link" in Share also makes a link that shows only the dashboard, without the sheet.</w:t>
+        <w:t xml:space="preserve">"Create link" in Share makes a link that shows only the dashboard.</w:t>
       </w:r>
     </w:p>
     <w:p>
@@ -1479,7 +1881,7 @@
         <w:rPr>
           <w:rFonts w:ascii="Arial" w:cs="Nirmala UI" w:eastAsia="Yu Gothic" w:hAnsi="Arial"/>
         </w:rPr>
-        <w:t xml:space="preserve">Each ATI name must be unique. Pastes with the same name are treated as the same ATI.</w:t>
+        <w:t xml:space="preserve">Each ATI name must be unique. The same name is treated as the same ATI.</w:t>
       </w:r>
     </w:p>
     <w:p>
@@ -1495,7 +1897,7 @@
         <w:rPr>
           <w:rFonts w:ascii="Arial" w:cs="Nirmala UI" w:eastAsia="Yu Gothic" w:hAnsi="Arial"/>
         </w:rPr>
-        <w:t xml:space="preserve">Each paste contains all data of that ATI (not a difference), so the sheet grows with every paste. The teacher may delete old pastes from time to time (rows whose "Upload" in column B is older). One paste is about 190 rows.</w:t>
+        <w:t xml:space="preserve">Each send puts all data of that ATI into one row (not a difference). "Updated" in the sheet is U plus a number for the time of sending; the app fills it in. Do not change it, the header row or the column names.</w:t>
       </w:r>
     </w:p>
     <w:p>
@@ -1511,7 +1913,7 @@
         <w:rPr>
           <w:rFonts w:ascii="Arial" w:cs="Nirmala UI" w:eastAsia="Yu Gothic" w:hAnsi="Arial"/>
         </w:rPr>
-        <w:t xml:space="preserve">Column B "Upload" is a number for the date and time of the paste (year, month, day, hour, minute). The app fills it in. Do not change it, the header row, or the order of the columns.</w:t>
+        <w:t xml:space="preserve">If the same ATI is used on two phones, the version saved last is the newest in the sheet. Press Refresh to load the newest before entering data.</w:t>
       </w:r>
     </w:p>
     <w:p>
@@ -1527,7 +1929,7 @@
         <w:rPr>
           <w:rFonts w:ascii="Arial" w:cs="Nirmala UI" w:eastAsia="Yu Gothic" w:hAnsi="Arial"/>
         </w:rPr>
-        <w:t xml:space="preserve">The app can read dates even if the sheet converts them to another format.</w:t>
+        <w:t xml:space="preserve">Verified: the app's calculations equal the original Excel values; required-item checks, corrections, demo, sending to the form and restoring/loading from the sheet (with mock data in place of Google, including two simulated phones).</w:t>
       </w:r>
     </w:p>
     <w:p>
@@ -1543,23 +1945,7 @@
         <w:rPr>
           <w:rFonts w:ascii="Arial" w:cs="Nirmala UI" w:eastAsia="Yu Gothic" w:hAnsi="Arial"/>
         </w:rPr>
-        <w:t xml:space="preserve">Verified: the app's calculations equal the original Excel values; required-item checks, corrections, demo, the format of the copied rows and loading (with mock data in place of Google).</w:t>
-      </w:r>
-    </w:p>
-    <w:p>
-      <w:pPr>
-        <w:pStyle w:val="ListParagraph"/>
-        <w:numPr>
-          <w:ilvl w:val="0"/>
-          <w:numId w:val="3"/>
-        </w:numPr>
-        <w:spacing w:after="60" w:line="290"/>
-      </w:pPr>
-      <w:r>
-        <w:rPr>
-          <w:rFonts w:ascii="Arial" w:cs="Nirmala UI" w:eastAsia="Yu Gothic" w:hAnsi="Arial"/>
-        </w:rPr>
-        <w:t xml:space="preserve">Not verified: pasting into a real Google Sheet and loading the published CSV, behaviour on real phones, correctness of the Bengali. Test with the first ATI before handing it out.</w:t>
+        <w:t xml:space="preserve">Not verified: sending to a real Google Form, loading the published CSV, behaviour on real phones, correctness of the Bengali. Test with the first ATI before handing it out.</w:t>
       </w:r>
     </w:p>
     <w:sectPr>

</xml_diff>

<commit_message>
Switch from Google Form to Apps Script web app (auto write/read of the shared sheet)
Co-Authored-By: Claude Sonnet 5.5 <noreply@anthropic.com>
Claude-Session: https://claude.ai/code/session_01M3YQQoTMjJVd24svSbk5Ra
</commit_message>
<xml_diff>
--- a/manual/ATI_Monitor_App_Manual_EN.docx
+++ b/manual/ATI_Monitor_App_Manual_EN.docx
@@ -32,7 +32,7 @@
           <w:sz w:val="22"/>
           <w:szCs w:val="22"/>
         </w:rPr>
-        <w:t xml:space="preserve">Entry, automatic calculation, automatic saving to the Google Sheet and comparison with other ATIs</w:t>
+        <w:t xml:space="preserve">Entry, automatic calculation, automatic writing to the Google Sheet and comparison with other ATIs</w:t>
       </w:r>
     </w:p>
     <w:p>
@@ -60,7 +60,7 @@
         <w:rPr>
           <w:rFonts w:ascii="Arial" w:cs="Nirmala UI" w:eastAsia="Yu Gothic" w:hAnsi="Arial"/>
         </w:rPr>
-        <w:t xml:space="preserve">ATI Water Monitor is a smartphone app for recording the water level of the FP (Farmers' Practice) plot and the 3F4D+MD plot. When you save, the data are sent automatically to the shared Google Sheet prepared by the teacher, through a Google Form. The dashboard shows the data kept in the sheet, not only the data on the phone. You can compare your ATI with the other ATIs in graphs.</w:t>
+        <w:t xml:space="preserve">ATI Water Monitor is a smartphone app for recording the water level of the FP (Farmers' Practice) plot and the 3F4D+MD plot. When you save, the data are written automatically into the shared Google Sheet prepared by the teacher, through a script in the sheet (Google Apps Script). The dashboard shows the data kept in the sheet, not only the data on the phone. You can compare your ATI with the other ATIs in graphs.</w:t>
       </w:r>
     </w:p>
     <w:tbl>
@@ -221,7 +221,7 @@
                 <w:sz w:val="19"/>
                 <w:szCs w:val="19"/>
               </w:rPr>
-              <w:t xml:space="preserve">2. Sent automatically</w:t>
+              <w:t xml:space="preserve">2. Written automatically</w:t>
             </w:r>
           </w:p>
         </w:tc>
@@ -247,7 +247,7 @@
                 <w:sz w:val="19"/>
                 <w:szCs w:val="19"/>
               </w:rPr>
-              <w:t xml:space="preserve">When you save (for example "Save entry"), the data are sent to the shared sheet a few seconds later. No pasting is needed.</w:t>
+              <w:t xml:space="preserve">When you save (for example "Save entry"), the data are written into the shared sheet a few seconds later. No pasting is needed.</w:t>
             </w:r>
           </w:p>
         </w:tc>
@@ -335,7 +335,7 @@
           <w:sz w:val="30"/>
           <w:szCs w:val="30"/>
         </w:rPr>
-        <w:t xml:space="preserve">2. Teacher setup (Google Form and shared sheet)</w:t>
+        <w:t xml:space="preserve">2. Teacher setup (Excel template and sheet script)</w:t>
       </w:r>
     </w:p>
     <w:p>
@@ -346,7 +346,7 @@
         <w:rPr>
           <w:rFonts w:ascii="Arial" w:cs="Nirmala UI" w:eastAsia="Yu Gothic" w:hAnsi="Arial"/>
         </w:rPr>
-        <w:t xml:space="preserve">The administrator (for example a teacher) does this once. All ATIs that want to compare use the same form and the same sheet.</w:t>
+        <w:t xml:space="preserve">The administrator (for example a teacher) does this once. All ATIs that want to compare use the same sheet.</w:t>
       </w:r>
     </w:p>
     <w:p>
@@ -364,29 +364,13 @@
           <w:b/>
           <w:bCs/>
         </w:rPr>
-        <w:t xml:space="preserve">Make the form</w:t>
-      </w:r>
-      <w:r>
-        <w:rPr>
-          <w:rFonts w:ascii="Arial" w:cs="Nirmala UI" w:eastAsia="Yu Gothic" w:hAnsi="Arial"/>
-        </w:rPr>
-        <w:t xml:space="preserve">: create a new Google Form with these four questions, in this order, with exactly these names: ATI (short answer), Updated (short answer), Summary (short answer), Data (paragraph). Keep the names exactly, including capital letters. Do not make them "Required".</w:t>
-      </w:r>
-    </w:p>
-    <w:p>
-      <w:pPr>
-        <w:pStyle w:val="ListParagraph"/>
-        <w:numPr>
-          <w:ilvl w:val="0"/>
-          <w:numId w:val="2"/>
-        </w:numPr>
-        <w:spacing w:after="80" w:line="290"/>
-      </w:pPr>
-      <w:r>
-        <w:rPr>
-          <w:rFonts w:ascii="Arial" w:cs="Nirmala UI" w:eastAsia="Yu Gothic" w:hAnsi="Arial"/>
-        </w:rPr>
-        <w:t xml:space="preserve">In the form settings, turn OFF "Require sign-in", "Limit to 1 response" and "Collect email addresses" (so that students can send without signing in). Keep the form open for responses.</w:t>
+        <w:t xml:space="preserve">Make the sheet</w:t>
+      </w:r>
+      <w:r>
+        <w:rPr>
+          <w:rFonts w:ascii="Arial" w:cs="Nirmala UI" w:eastAsia="Yu Gothic" w:hAnsi="Arial"/>
+        </w:rPr>
+        <w:t xml:space="preserve">: in the app, open the Setup tab and download the template ATI_Monitor_Shared_TEMPLATE.xlsx with "Excel template". Upload it to Google Drive, open it and choose "File &gt; Save as Google Sheets".</w:t>
       </w:r>
     </w:p>
     <w:p>
@@ -404,13 +388,13 @@
           <w:b/>
           <w:bCs/>
         </w:rPr>
-        <w:t xml:space="preserve">Form link</w:t>
-      </w:r>
-      <w:r>
-        <w:rPr>
-          <w:rFonts w:ascii="Arial" w:cs="Nirmala UI" w:eastAsia="Yu Gothic" w:hAnsi="Arial"/>
-        </w:rPr>
-        <w:t xml:space="preserve">: open the "︙" menu at the top right &gt; "Get pre-filled link". In the four questions, type ATI, UPDATED, SUMMARY and DATA (the question names in capital letters). Press "Get link" &gt; "Copy link".</w:t>
+        <w:t xml:space="preserve">Paste the script</w:t>
+      </w:r>
+      <w:r>
+        <w:rPr>
+          <w:rFonts w:ascii="Arial" w:cs="Nirmala UI" w:eastAsia="Yu Gothic" w:hAnsi="Arial"/>
+        </w:rPr>
+        <w:t xml:space="preserve">: in the sheet open "Extensions &gt; Apps Script". Delete the sample code that is already there, paste the script and press Save (the disk icon). You can copy the script with "Copy script" in the app (Share tab &gt; Google Sheet connection); "Download script (.gs)" gives the file.</w:t>
       </w:r>
     </w:p>
     <w:p>
@@ -428,13 +412,29 @@
           <w:b/>
           <w:bCs/>
         </w:rPr>
-        <w:t xml:space="preserve">Make the sheet</w:t>
-      </w:r>
-      <w:r>
-        <w:rPr>
-          <w:rFonts w:ascii="Arial" w:cs="Nirmala UI" w:eastAsia="Yu Gothic" w:hAnsi="Arial"/>
-        </w:rPr>
-        <w:t xml:space="preserve">: in the form, open the "Responses" tab and press "Link to Sheets" to create the response sheet.</w:t>
+        <w:t xml:space="preserve">Publish (deploy)</w:t>
+      </w:r>
+      <w:r>
+        <w:rPr>
+          <w:rFonts w:ascii="Arial" w:cs="Nirmala UI" w:eastAsia="Yu Gothic" w:hAnsi="Arial"/>
+        </w:rPr>
+        <w:t xml:space="preserve">: press "Deploy &gt; New deployment" at the top right. Use the gear icon to choose the type "Web app". Set "Execute as" to "Me" and "Who has access" to "Anyone", then press "Deploy".</w:t>
+      </w:r>
+    </w:p>
+    <w:p>
+      <w:pPr>
+        <w:pStyle w:val="ListParagraph"/>
+        <w:numPr>
+          <w:ilvl w:val="0"/>
+          <w:numId w:val="2"/>
+        </w:numPr>
+        <w:spacing w:after="80" w:line="290"/>
+      </w:pPr>
+      <w:r>
+        <w:rPr>
+          <w:rFonts w:ascii="Arial" w:cs="Nirmala UI" w:eastAsia="Yu Gothic" w:hAnsi="Arial"/>
+        </w:rPr>
+        <w:t xml:space="preserve">The first time, an "Authorize access" screen appears. Choose your Google account. "Google hasn't verified this app" is shown, which is normal for a script you made yourself. Press "Advanced" &gt; "Go to (project) (unsafe)" &gt; "Allow".</w:t>
       </w:r>
     </w:p>
     <w:p>
@@ -452,13 +452,13 @@
           <w:b/>
           <w:bCs/>
         </w:rPr>
-        <w:t xml:space="preserve">Compare link</w:t>
-      </w:r>
-      <w:r>
-        <w:rPr>
-          <w:rFonts w:ascii="Arial" w:cs="Nirmala UI" w:eastAsia="Yu Gothic" w:hAnsi="Arial"/>
-        </w:rPr>
-        <w:t xml:space="preserve">: in that sheet, open "File &gt; Share &gt; Publish to web". Choose the response tab ("Form Responses 1") instead of "Entire document", choose the format "Comma-separated values (.csv)" and press "Publish". Copy the link shown.</w:t>
+        <w:t xml:space="preserve">Web app URL</w:t>
+      </w:r>
+      <w:r>
+        <w:rPr>
+          <w:rFonts w:ascii="Arial" w:cs="Nirmala UI" w:eastAsia="Yu Gothic" w:hAnsi="Arial"/>
+        </w:rPr>
+        <w:t xml:space="preserve">: when the deployment is done, a URL ending in "/exec" is shown. Copy it. (To see it later, use the sheet menu "ATI Monitor &gt; Show web app URL".)</w:t>
       </w:r>
     </w:p>
     <w:p>
@@ -482,7 +482,7 @@
         <w:rPr>
           <w:rFonts w:ascii="Arial" w:cs="Nirmala UI" w:eastAsia="Yu Gothic" w:hAnsi="Arial"/>
         </w:rPr>
-        <w:t xml:space="preserve">: in the app, open Share &gt; Google Sheet connection and paste the form link and the compare link. Press "Create class setup link" to make one link, and send that link to the students. When a student opens it, both links are filled in automatically.</w:t>
+        <w:t xml:space="preserve">: in the app, open Share &gt; Google Sheet connection and paste the URL. Press "Test connection" and check that it says "Connected". Press "Create class setup link" to make one link, and send that link to the students. When a student opens it, the URL is filled in automatically.</w:t>
       </w:r>
     </w:p>
     <w:tbl>
@@ -534,7 +534,7 @@
               <w:rPr>
                 <w:rFonts w:ascii="Arial" w:cs="Nirmala UI" w:eastAsia="Yu Gothic" w:hAnsi="Arial"/>
               </w:rPr>
-              <w:t xml:space="preserve">Anyone who knows the form link can send data, so give it to the students only. Anyone who knows the compare link can read the data (water level, irrigation and so on; no farmer names). To stop publishing, press "Stop publishing" on the "Publish to web" screen. If rows are deleted by mistake, restore them with "File &gt; Version history".</w:t>
+              <w:t xml:space="preserve">Anyone who knows the URL can write data, so give the URL and the class setup link to the students only. If data are deleted by mistake, restore them with "File &gt; Version history". If you change the script, update it with "Deploy &gt; Manage deployments &gt; Edit &gt; New version".</w:t>
             </w:r>
           </w:p>
         </w:tc>
@@ -550,13 +550,13 @@
           <w:b/>
           <w:bCs/>
         </w:rPr>
-        <w:t xml:space="preserve">How the sheet grows: </w:t>
-      </w:r>
-      <w:r>
-        <w:rPr>
-          <w:rFonts w:ascii="Arial" w:cs="Nirmala UI" w:eastAsia="Yu Gothic" w:hAnsi="Arial"/>
-        </w:rPr>
-        <w:t xml:space="preserve">Every save adds one row (about 2-3 KB). Only the newest row of each ATI is used. You may delete old rows from time to time (never the newest row of an ATI). If the sheet becomes large, you can make another tab "Latest": write ATI, Updated, Summary, Data in A1:D1, put =SORTN(SORT('Form Responses 1'!B2:E,2,FALSE),9999,2,1,TRUE) in A2, and publish that tab instead. (This formula is not verified. Try it first.)</w:t>
+        <w:t xml:space="preserve">What is in the sheet: </w:t>
+      </w:r>
+      <w:r>
+        <w:rPr>
+          <w:rFonts w:ascii="Arial" w:cs="Nirmala UI" w:eastAsia="Yu Gothic" w:hAnsi="Arial"/>
+        </w:rPr>
+        <w:t xml:space="preserve">On every save, the rows of that ATI are replaced (the sheet does not keep growing). The tab "Data" lists the daily results in a readable form, the tab "ATIs" has one summary row per ATI, and "_Store" is a hidden tab used by the app. The script fills them in. Do not edit them by hand, and do not change the header rows or the tab names.</w:t>
       </w:r>
     </w:p>
     <w:p>
@@ -807,7 +807,7 @@
         <w:rPr>
           <w:rFonts w:ascii="Arial" w:cs="Nirmala UI" w:eastAsia="Yu Gothic" w:hAnsi="Arial"/>
         </w:rPr>
-        <w:t xml:space="preserve">After saving, the data are sent to the sheet automatically a few seconds later. The line above the dashboard shows the state.</w:t>
+        <w:t xml:space="preserve">After saving, the data are written into the sheet automatically a few seconds later. The line above the dashboard shows the state.</w:t>
       </w:r>
     </w:p>
     <w:tbl>
@@ -823,8 +823,8 @@
         </w:tblBorders>
       </w:tblPr>
       <w:tblGrid>
-        <w:gridCol w:w="3000"/>
-        <w:gridCol w:w="6360"/>
+        <w:gridCol w:w="3200"/>
+        <w:gridCol w:w="6160"/>
       </w:tblGrid>
       <w:tr>
         <w:trPr>
@@ -832,7 +832,7 @@
         </w:trPr>
         <w:tc>
           <w:tcPr>
-            <w:tcW w:type="dxa" w:w="3000"/>
+            <w:tcW w:type="dxa" w:w="3200"/>
             <w:shd w:fill="DCE8EC" w:val="clear"/>
             <w:tcMar>
               <w:top w:type="dxa" w:w="60"/>
@@ -859,7 +859,7 @@
         </w:tc>
         <w:tc>
           <w:tcPr>
-            <w:tcW w:type="dxa" w:w="6360"/>
+            <w:tcW w:type="dxa" w:w="6160"/>
             <w:shd w:fill="DCE8EC" w:val="clear"/>
             <w:tcMar>
               <w:top w:type="dxa" w:w="60"/>
@@ -891,53 +891,53 @@
         </w:trPr>
         <w:tc>
           <w:tcPr>
-            <w:tcW w:type="dxa" w:w="3000"/>
-            <w:tcMar>
-              <w:top w:type="dxa" w:w="60"/>
-              <w:left w:type="dxa" w:w="100"/>
-              <w:bottom w:type="dxa" w:w="60"/>
-              <w:right w:type="dxa" w:w="100"/>
-            </w:tcMar>
-          </w:tcPr>
-          <w:p>
-            <w:pPr>
-              <w:spacing w:after="20" w:line="270"/>
-            </w:pPr>
-            <w:r>
-              <w:rPr>
-                <w:rFonts w:ascii="Arial" w:cs="Nirmala UI" w:eastAsia="Yu Gothic" w:hAnsi="Arial"/>
-                <w:b w:val="false"/>
-                <w:bCs w:val="false"/>
-                <w:sz w:val="19"/>
-                <w:szCs w:val="19"/>
-              </w:rPr>
-              <w:t xml:space="preserve">Not yet sent</w:t>
-            </w:r>
-          </w:p>
-        </w:tc>
-        <w:tc>
-          <w:tcPr>
-            <w:tcW w:type="dxa" w:w="6360"/>
-            <w:tcMar>
-              <w:top w:type="dxa" w:w="60"/>
-              <w:left w:type="dxa" w:w="100"/>
-              <w:bottom w:type="dxa" w:w="60"/>
-              <w:right w:type="dxa" w:w="100"/>
-            </w:tcMar>
-          </w:tcPr>
-          <w:p>
-            <w:pPr>
-              <w:spacing w:after="20" w:line="270"/>
-            </w:pPr>
-            <w:r>
-              <w:rPr>
-                <w:rFonts w:ascii="Arial" w:cs="Nirmala UI" w:eastAsia="Yu Gothic" w:hAnsi="Arial"/>
-                <w:b w:val="false"/>
-                <w:bCs w:val="false"/>
-                <w:sz w:val="19"/>
-                <w:szCs w:val="19"/>
-              </w:rPr>
-              <w:t xml:space="preserve">Not sent yet. It is sent automatically when the phone is online. You can also press "Send now".</w:t>
+            <w:tcW w:type="dxa" w:w="3200"/>
+            <w:tcMar>
+              <w:top w:type="dxa" w:w="60"/>
+              <w:left w:type="dxa" w:w="100"/>
+              <w:bottom w:type="dxa" w:w="60"/>
+              <w:right w:type="dxa" w:w="100"/>
+            </w:tcMar>
+          </w:tcPr>
+          <w:p>
+            <w:pPr>
+              <w:spacing w:after="20" w:line="270"/>
+            </w:pPr>
+            <w:r>
+              <w:rPr>
+                <w:rFonts w:ascii="Arial" w:cs="Nirmala UI" w:eastAsia="Yu Gothic" w:hAnsi="Arial"/>
+                <w:b w:val="false"/>
+                <w:bCs w:val="false"/>
+                <w:sz w:val="19"/>
+                <w:szCs w:val="19"/>
+              </w:rPr>
+              <w:t xml:space="preserve">Not yet saved in the Google Sheet.</w:t>
+            </w:r>
+          </w:p>
+        </w:tc>
+        <w:tc>
+          <w:tcPr>
+            <w:tcW w:type="dxa" w:w="6160"/>
+            <w:tcMar>
+              <w:top w:type="dxa" w:w="60"/>
+              <w:left w:type="dxa" w:w="100"/>
+              <w:bottom w:type="dxa" w:w="60"/>
+              <w:right w:type="dxa" w:w="100"/>
+            </w:tcMar>
+          </w:tcPr>
+          <w:p>
+            <w:pPr>
+              <w:spacing w:after="20" w:line="270"/>
+            </w:pPr>
+            <w:r>
+              <w:rPr>
+                <w:rFonts w:ascii="Arial" w:cs="Nirmala UI" w:eastAsia="Yu Gothic" w:hAnsi="Arial"/>
+                <w:b w:val="false"/>
+                <w:bCs w:val="false"/>
+                <w:sz w:val="19"/>
+                <w:szCs w:val="19"/>
+              </w:rPr>
+              <w:t xml:space="preserve">The sheet does not have it yet. It is sent automatically when the phone is online. You can also press "Send now".</w:t>
             </w:r>
           </w:p>
         </w:tc>
@@ -948,53 +948,53 @@
         </w:trPr>
         <w:tc>
           <w:tcPr>
-            <w:tcW w:type="dxa" w:w="3000"/>
-            <w:tcMar>
-              <w:top w:type="dxa" w:w="60"/>
-              <w:left w:type="dxa" w:w="100"/>
-              <w:bottom w:type="dxa" w:w="60"/>
-              <w:right w:type="dxa" w:w="100"/>
-            </w:tcMar>
-          </w:tcPr>
-          <w:p>
-            <w:pPr>
-              <w:spacing w:after="20" w:line="270"/>
-            </w:pPr>
-            <w:r>
-              <w:rPr>
-                <w:rFonts w:ascii="Arial" w:cs="Nirmala UI" w:eastAsia="Yu Gothic" w:hAnsi="Arial"/>
-                <w:b w:val="false"/>
-                <w:bCs w:val="false"/>
-                <w:sz w:val="19"/>
-                <w:szCs w:val="19"/>
-              </w:rPr>
-              <w:t xml:space="preserve">Sent. Waiting for the sheet…</w:t>
-            </w:r>
-          </w:p>
-        </w:tc>
-        <w:tc>
-          <w:tcPr>
-            <w:tcW w:type="dxa" w:w="6360"/>
-            <w:tcMar>
-              <w:top w:type="dxa" w:w="60"/>
-              <w:left w:type="dxa" w:w="100"/>
-              <w:bottom w:type="dxa" w:w="60"/>
-              <w:right w:type="dxa" w:w="100"/>
-            </w:tcMar>
-          </w:tcPr>
-          <w:p>
-            <w:pPr>
-              <w:spacing w:after="20" w:line="270"/>
-            </w:pPr>
-            <w:r>
-              <w:rPr>
-                <w:rFonts w:ascii="Arial" w:cs="Nirmala UI" w:eastAsia="Yu Gothic" w:hAnsi="Arial"/>
-                <w:b w:val="false"/>
-                <w:bCs w:val="false"/>
-                <w:sz w:val="19"/>
-                <w:szCs w:val="19"/>
-              </w:rPr>
-              <w:t xml:space="preserve">Sent. The sheet needs a few minutes to show it. Wait.</w:t>
+            <w:tcW w:type="dxa" w:w="3200"/>
+            <w:tcMar>
+              <w:top w:type="dxa" w:w="60"/>
+              <w:left w:type="dxa" w:w="100"/>
+              <w:bottom w:type="dxa" w:w="60"/>
+              <w:right w:type="dxa" w:w="100"/>
+            </w:tcMar>
+          </w:tcPr>
+          <w:p>
+            <w:pPr>
+              <w:spacing w:after="20" w:line="270"/>
+            </w:pPr>
+            <w:r>
+              <w:rPr>
+                <w:rFonts w:ascii="Arial" w:cs="Nirmala UI" w:eastAsia="Yu Gothic" w:hAnsi="Arial"/>
+                <w:b w:val="false"/>
+                <w:bCs w:val="false"/>
+                <w:sz w:val="19"/>
+                <w:szCs w:val="19"/>
+              </w:rPr>
+              <w:t xml:space="preserve">Saved in Google Sheet</w:t>
+            </w:r>
+          </w:p>
+        </w:tc>
+        <w:tc>
+          <w:tcPr>
+            <w:tcW w:type="dxa" w:w="6160"/>
+            <w:tcMar>
+              <w:top w:type="dxa" w:w="60"/>
+              <w:left w:type="dxa" w:w="100"/>
+              <w:bottom w:type="dxa" w:w="60"/>
+              <w:right w:type="dxa" w:w="100"/>
+            </w:tcMar>
+          </w:tcPr>
+          <w:p>
+            <w:pPr>
+              <w:spacing w:after="20" w:line="270"/>
+            </w:pPr>
+            <w:r>
+              <w:rPr>
+                <w:rFonts w:ascii="Arial" w:cs="Nirmala UI" w:eastAsia="Yu Gothic" w:hAnsi="Arial"/>
+                <w:b w:val="false"/>
+                <w:bCs w:val="false"/>
+                <w:sz w:val="19"/>
+                <w:szCs w:val="19"/>
+              </w:rPr>
+              <w:t xml:space="preserve">The sheet has it. This is the normal state.</w:t>
             </w:r>
           </w:p>
         </w:tc>
@@ -1005,53 +1005,53 @@
         </w:trPr>
         <w:tc>
           <w:tcPr>
-            <w:tcW w:type="dxa" w:w="3000"/>
-            <w:tcMar>
-              <w:top w:type="dxa" w:w="60"/>
-              <w:left w:type="dxa" w:w="100"/>
-              <w:bottom w:type="dxa" w:w="60"/>
-              <w:right w:type="dxa" w:w="100"/>
-            </w:tcMar>
-          </w:tcPr>
-          <w:p>
-            <w:pPr>
-              <w:spacing w:after="20" w:line="270"/>
-            </w:pPr>
-            <w:r>
-              <w:rPr>
-                <w:rFonts w:ascii="Arial" w:cs="Nirmala UI" w:eastAsia="Yu Gothic" w:hAnsi="Arial"/>
-                <w:b w:val="false"/>
-                <w:bCs w:val="false"/>
-                <w:sz w:val="19"/>
-                <w:szCs w:val="19"/>
-              </w:rPr>
-              <w:t xml:space="preserve">Saved in Google Sheet</w:t>
-            </w:r>
-          </w:p>
-        </w:tc>
-        <w:tc>
-          <w:tcPr>
-            <w:tcW w:type="dxa" w:w="6360"/>
-            <w:tcMar>
-              <w:top w:type="dxa" w:w="60"/>
-              <w:left w:type="dxa" w:w="100"/>
-              <w:bottom w:type="dxa" w:w="60"/>
-              <w:right w:type="dxa" w:w="100"/>
-            </w:tcMar>
-          </w:tcPr>
-          <w:p>
-            <w:pPr>
-              <w:spacing w:after="20" w:line="270"/>
-            </w:pPr>
-            <w:r>
-              <w:rPr>
-                <w:rFonts w:ascii="Arial" w:cs="Nirmala UI" w:eastAsia="Yu Gothic" w:hAnsi="Arial"/>
-                <w:b w:val="false"/>
-                <w:bCs w:val="false"/>
-                <w:sz w:val="19"/>
-                <w:szCs w:val="19"/>
-              </w:rPr>
-              <w:t xml:space="preserve">The sheet has it. This is the normal state.</w:t>
+            <w:tcW w:type="dxa" w:w="3200"/>
+            <w:tcMar>
+              <w:top w:type="dxa" w:w="60"/>
+              <w:left w:type="dxa" w:w="100"/>
+              <w:bottom w:type="dxa" w:w="60"/>
+              <w:right w:type="dxa" w:w="100"/>
+            </w:tcMar>
+          </w:tcPr>
+          <w:p>
+            <w:pPr>
+              <w:spacing w:after="20" w:line="270"/>
+            </w:pPr>
+            <w:r>
+              <w:rPr>
+                <w:rFonts w:ascii="Arial" w:cs="Nirmala UI" w:eastAsia="Yu Gothic" w:hAnsi="Arial"/>
+                <w:b w:val="false"/>
+                <w:bCs w:val="false"/>
+                <w:sz w:val="19"/>
+                <w:szCs w:val="19"/>
+              </w:rPr>
+              <w:t xml:space="preserve">No internet or no answer…</w:t>
+            </w:r>
+          </w:p>
+        </w:tc>
+        <w:tc>
+          <w:tcPr>
+            <w:tcW w:type="dxa" w:w="6160"/>
+            <w:tcMar>
+              <w:top w:type="dxa" w:w="60"/>
+              <w:left w:type="dxa" w:w="100"/>
+              <w:bottom w:type="dxa" w:w="60"/>
+              <w:right w:type="dxa" w:w="100"/>
+            </w:tcMar>
+          </w:tcPr>
+          <w:p>
+            <w:pPr>
+              <w:spacing w:after="20" w:line="270"/>
+            </w:pPr>
+            <w:r>
+              <w:rPr>
+                <w:rFonts w:ascii="Arial" w:cs="Nirmala UI" w:eastAsia="Yu Gothic" w:hAnsi="Arial"/>
+                <w:b w:val="false"/>
+                <w:bCs w:val="false"/>
+                <w:sz w:val="19"/>
+                <w:szCs w:val="19"/>
+              </w:rPr>
+              <w:t xml:space="preserve">No internet, or the sheet does not answer. It is sent again when the connection is back. If this continues, ask the teacher to check the URL and the deployment.</w:t>
             </w:r>
           </w:p>
         </w:tc>
@@ -1062,53 +1062,53 @@
         </w:trPr>
         <w:tc>
           <w:tcPr>
-            <w:tcW w:type="dxa" w:w="3000"/>
-            <w:tcMar>
-              <w:top w:type="dxa" w:w="60"/>
-              <w:left w:type="dxa" w:w="100"/>
-              <w:bottom w:type="dxa" w:w="60"/>
-              <w:right w:type="dxa" w:w="100"/>
-            </w:tcMar>
-          </w:tcPr>
-          <w:p>
-            <w:pPr>
-              <w:spacing w:after="20" w:line="270"/>
-            </w:pPr>
-            <w:r>
-              <w:rPr>
-                <w:rFonts w:ascii="Arial" w:cs="Nirmala UI" w:eastAsia="Yu Gothic" w:hAnsi="Arial"/>
-                <w:b w:val="false"/>
-                <w:bCs w:val="false"/>
-                <w:sz w:val="19"/>
-                <w:szCs w:val="19"/>
-              </w:rPr>
-              <w:t xml:space="preserve">Sent, but the sheet does not show it yet</w:t>
-            </w:r>
-          </w:p>
-        </w:tc>
-        <w:tc>
-          <w:tcPr>
-            <w:tcW w:type="dxa" w:w="6360"/>
-            <w:tcMar>
-              <w:top w:type="dxa" w:w="60"/>
-              <w:left w:type="dxa" w:w="100"/>
-              <w:bottom w:type="dxa" w:w="60"/>
-              <w:right w:type="dxa" w:w="100"/>
-            </w:tcMar>
-          </w:tcPr>
-          <w:p>
-            <w:pPr>
-              <w:spacing w:after="20" w:line="270"/>
-            </w:pPr>
-            <w:r>
-              <w:rPr>
-                <w:rFonts w:ascii="Arial" w:cs="Nirmala UI" w:eastAsia="Yu Gothic" w:hAnsi="Arial"/>
-                <w:b w:val="false"/>
-                <w:bCs w:val="false"/>
-                <w:sz w:val="19"/>
-                <w:szCs w:val="19"/>
-              </w:rPr>
-              <w:t xml:space="preserve">Not in the sheet after 20 minutes. Check the form link and press "Send now".</w:t>
+            <w:tcW w:type="dxa" w:w="3200"/>
+            <w:tcMar>
+              <w:top w:type="dxa" w:w="60"/>
+              <w:left w:type="dxa" w:w="100"/>
+              <w:bottom w:type="dxa" w:w="60"/>
+              <w:right w:type="dxa" w:w="100"/>
+            </w:tcMar>
+          </w:tcPr>
+          <w:p>
+            <w:pPr>
+              <w:spacing w:after="20" w:line="270"/>
+            </w:pPr>
+            <w:r>
+              <w:rPr>
+                <w:rFonts w:ascii="Arial" w:cs="Nirmala UI" w:eastAsia="Yu Gothic" w:hAnsi="Arial"/>
+                <w:b w:val="false"/>
+                <w:bCs w:val="false"/>
+                <w:sz w:val="19"/>
+                <w:szCs w:val="19"/>
+              </w:rPr>
+              <w:t xml:space="preserve">The sheet script refused the data…</w:t>
+            </w:r>
+          </w:p>
+        </w:tc>
+        <w:tc>
+          <w:tcPr>
+            <w:tcW w:type="dxa" w:w="6160"/>
+            <w:tcMar>
+              <w:top w:type="dxa" w:w="60"/>
+              <w:left w:type="dxa" w:w="100"/>
+              <w:bottom w:type="dxa" w:w="60"/>
+              <w:right w:type="dxa" w:w="100"/>
+            </w:tcMar>
+          </w:tcPr>
+          <w:p>
+            <w:pPr>
+              <w:spacing w:after="20" w:line="270"/>
+            </w:pPr>
+            <w:r>
+              <w:rPr>
+                <w:rFonts w:ascii="Arial" w:cs="Nirmala UI" w:eastAsia="Yu Gothic" w:hAnsi="Arial"/>
+                <w:b w:val="false"/>
+                <w:bCs w:val="false"/>
+                <w:sz w:val="19"/>
+                <w:szCs w:val="19"/>
+              </w:rPr>
+              <w:t xml:space="preserve">The sheet script did not accept the data. Tell the teacher.</w:t>
             </w:r>
           </w:p>
         </w:tc>
@@ -1122,7 +1122,7 @@
         <w:rPr>
           <w:rFonts w:ascii="Arial" w:cs="Nirmala UI" w:eastAsia="Yu Gothic" w:hAnsi="Arial"/>
         </w:rPr>
-        <w:t xml:space="preserve">You can enter and save in the field without internet. The data stay on the phone for a while and are sent when the phone is online again.</w:t>
+        <w:t xml:space="preserve">You can enter and save in the field without internet. The data stay on the phone for a while and are written into the sheet when the phone is online again.</w:t>
       </w:r>
     </w:p>
     <w:tbl>
@@ -1671,7 +1671,7 @@
         <w:rPr>
           <w:rFonts w:ascii="Arial" w:cs="Nirmala UI" w:eastAsia="Yu Gothic" w:hAnsi="Arial"/>
         </w:rPr>
-        <w:t xml:space="preserve">The Compare tab reads all ATIs in the sheet when the app opens. Press "Refresh from sheet" to read again. Tick the ATIs you want to see.</w:t>
+        <w:t xml:space="preserve">The Compare tab reads all ATIs in the sheet when the app opens (and again every 5 minutes). Press "Refresh from sheet" to read again. Tick the ATIs you want to see.</w:t>
       </w:r>
     </w:p>
     <w:p>
@@ -1897,7 +1897,7 @@
         <w:rPr>
           <w:rFonts w:ascii="Arial" w:cs="Nirmala UI" w:eastAsia="Yu Gothic" w:hAnsi="Arial"/>
         </w:rPr>
-        <w:t xml:space="preserve">Each send puts all data of that ATI into one row (not a difference). "Updated" in the sheet is U plus a number for the time of sending; the app fills it in. Do not change it, the header row or the column names.</w:t>
+        <w:t xml:space="preserve">On every save, all data of that ATI are written into the sheet (not a difference). The script fills in the sheet; do not edit it by hand.</w:t>
       </w:r>
     </w:p>
     <w:p>
@@ -1929,7 +1929,7 @@
         <w:rPr>
           <w:rFonts w:ascii="Arial" w:cs="Nirmala UI" w:eastAsia="Yu Gothic" w:hAnsi="Arial"/>
         </w:rPr>
-        <w:t xml:space="preserve">Verified: the app's calculations equal the original Excel values; required-item checks, corrections, demo, sending to the form and restoring/loading from the sheet (with mock data in place of Google, including two simulated phones).</w:t>
+        <w:t xml:space="preserve">Verified: the app's calculations equal the original Excel values; required-item checks, corrections, demo, writing to the script and restoring/loading from the sheet (with a mock in place of Google, including two simulated phones). The script itself (write, replace, read) was also tested on a mock sheet.</w:t>
       </w:r>
     </w:p>
     <w:p>
@@ -1945,7 +1945,7 @@
         <w:rPr>
           <w:rFonts w:ascii="Arial" w:cs="Nirmala UI" w:eastAsia="Yu Gothic" w:hAnsi="Arial"/>
         </w:rPr>
-        <w:t xml:space="preserve">Not verified: sending to a real Google Form, loading the published CSV, behaviour on real phones, correctness of the Bengali. Test with the first ATI before handing it out.</w:t>
+        <w:t xml:space="preserve">Not verified: a real Google Sheet (the authorization screens, deployment, writing, reading), behaviour on real phones, correctness of the Bengali. Test with the first ATI before handing it out.</w:t>
       </w:r>
     </w:p>
     <w:sectPr>

</xml_diff>

<commit_message>
UX: Today screen, 5-button navigation, entry sections, live water level, +/- buttons, photos, mobile layouts, teacher page, readable dates
Co-Authored-By: Claude Opus 5.5 <noreply@anthropic.com>
Claude-Session: https://claude.ai/code/session_01M3YQQoTMjJVd24svSbk5Ra
</commit_message>
<xml_diff>
--- a/manual/ATI_Monitor_App_Manual_EN.docx
+++ b/manual/ATI_Monitor_App_Manual_EN.docx
@@ -304,7 +304,7 @@
                 <w:sz w:val="19"/>
                 <w:szCs w:val="19"/>
               </w:rPr>
-              <w:t xml:space="preserve">The dashboard and the Compare tab show the data in the sheet. You can compare your ATI with the other ATIs in graphs.</w:t>
+              <w:t xml:space="preserve">Graphs and Compare show the data in the sheet. You can compare your ATI with the other ATIs in graphs.</w:t>
             </w:r>
           </w:p>
         </w:tc>
@@ -370,7 +370,7 @@
         <w:rPr>
           <w:rFonts w:ascii="Arial" w:cs="Nirmala UI" w:eastAsia="Yu Gothic" w:hAnsi="Arial"/>
         </w:rPr>
-        <w:t xml:space="preserve">: in the app, open the Setup tab and download the template ATI_Monitor_Shared_TEMPLATE.xlsx with "Excel template". Upload it to Google Drive, open it and choose "File &gt; Save as Google Sheets".</w:t>
+        <w:t xml:space="preserve">: in the app, open More &gt; For the teacher and download the template ATI_Monitor_Shared_TEMPLATE.xlsx with "Excel template". Upload it to Google Drive, open it and choose "File &gt; Save as Google Sheets".</w:t>
       </w:r>
     </w:p>
     <w:p>
@@ -394,7 +394,7 @@
         <w:rPr>
           <w:rFonts w:ascii="Arial" w:cs="Nirmala UI" w:eastAsia="Yu Gothic" w:hAnsi="Arial"/>
         </w:rPr>
-        <w:t xml:space="preserve">: in the sheet open "Extensions &gt; Apps Script". Delete the sample code that is already there, paste the script and press Save (the disk icon). You can copy the script with "Copy script" in the app (Share tab &gt; Google Sheet connection); "Download script (.gs)" gives the file.</w:t>
+        <w:t xml:space="preserve">: in the sheet open "Extensions &gt; Apps Script". Delete the sample code that is already there, paste the script and press Save (the disk icon). You can copy the script with "Copy script" in the app (More &gt; For the teacher); "Download script (.gs)" gives the file.</w:t>
       </w:r>
     </w:p>
     <w:p>
@@ -482,7 +482,7 @@
         <w:rPr>
           <w:rFonts w:ascii="Arial" w:cs="Nirmala UI" w:eastAsia="Yu Gothic" w:hAnsi="Arial"/>
         </w:rPr>
-        <w:t xml:space="preserve">: in the app, open Share &gt; Google Sheet connection and paste the URL. Press "Test connection" and check that it says "Connected". Press "Create class setup link" to make one link, and send that link to the students. When a student opens it, the URL is filled in automatically.</w:t>
+        <w:t xml:space="preserve">: in the app, open More &gt; For the teacher and paste the URL into "Web app URL". Press "Test connection" and check that it says "Connected". Press "Create class setup link" to make one link, and send that link to the students. When a student opens it, the URL is filled in automatically.</w:t>
       </w:r>
     </w:p>
     <w:tbl>
@@ -590,47 +590,401 @@
           <w:sz w:val="25"/>
           <w:szCs w:val="25"/>
         </w:rPr>
-        <w:t xml:space="preserve">3.1 The first time</w:t>
-      </w:r>
-    </w:p>
-    <w:p>
-      <w:pPr>
-        <w:pStyle w:val="ListParagraph"/>
-        <w:numPr>
-          <w:ilvl w:val="0"/>
-          <w:numId w:val="3"/>
-        </w:numPr>
-        <w:spacing w:after="60" w:line="290"/>
-      </w:pPr>
-      <w:r>
-        <w:rPr>
-          <w:rFonts w:ascii="Arial" w:cs="Nirmala UI" w:eastAsia="Yu Gothic" w:hAnsi="Arial"/>
-        </w:rPr>
-        <w:t xml:space="preserve">Open the "class setup link" from the teacher in Chrome on the phone. This connects the app to the shared sheet. In Chrome, choose "Add to Home screen" to start the app from an icon.</w:t>
-      </w:r>
-    </w:p>
-    <w:p>
-      <w:pPr>
-        <w:pStyle w:val="ListParagraph"/>
-        <w:numPr>
-          <w:ilvl w:val="0"/>
-          <w:numId w:val="3"/>
-        </w:numPr>
-        <w:spacing w:after="60" w:line="290"/>
+        <w:t xml:space="preserve">3.0 The five buttons at the bottom</w:t>
+      </w:r>
+    </w:p>
+    <w:tbl>
+      <w:tblPr>
+        <w:tblW w:type="dxa" w:w="9360"/>
+        <w:tblBorders>
+          <w:top w:val="single" w:color="BFC5C9" w:sz="4"/>
+          <w:left w:val="single" w:color="BFC5C9" w:sz="4"/>
+          <w:bottom w:val="single" w:color="BFC5C9" w:sz="4"/>
+          <w:right w:val="single" w:color="BFC5C9" w:sz="4"/>
+          <w:insideH w:val="single" w:color="BFC5C9" w:sz="4"/>
+          <w:insideV w:val="single" w:color="BFC5C9" w:sz="4"/>
+        </w:tblBorders>
+      </w:tblPr>
+      <w:tblGrid>
+        <w:gridCol w:w="2200"/>
+        <w:gridCol w:w="7160"/>
+      </w:tblGrid>
+      <w:tr>
+        <w:trPr>
+          <w:tblHeader/>
+        </w:trPr>
+        <w:tc>
+          <w:tcPr>
+            <w:tcW w:type="dxa" w:w="2200"/>
+            <w:shd w:fill="DCE8EC" w:val="clear"/>
+            <w:tcMar>
+              <w:top w:type="dxa" w:w="60"/>
+              <w:left w:type="dxa" w:w="100"/>
+              <w:bottom w:type="dxa" w:w="60"/>
+              <w:right w:type="dxa" w:w="100"/>
+            </w:tcMar>
+          </w:tcPr>
+          <w:p>
+            <w:pPr>
+              <w:spacing w:after="20" w:line="270"/>
+            </w:pPr>
+            <w:r>
+              <w:rPr>
+                <w:rFonts w:ascii="Arial" w:cs="Nirmala UI" w:eastAsia="Yu Gothic" w:hAnsi="Arial"/>
+                <w:b/>
+                <w:bCs/>
+                <w:sz w:val="19"/>
+                <w:szCs w:val="19"/>
+              </w:rPr>
+              <w:t xml:space="preserve">Button</w:t>
+            </w:r>
+          </w:p>
+        </w:tc>
+        <w:tc>
+          <w:tcPr>
+            <w:tcW w:type="dxa" w:w="7160"/>
+            <w:shd w:fill="DCE8EC" w:val="clear"/>
+            <w:tcMar>
+              <w:top w:type="dxa" w:w="60"/>
+              <w:left w:type="dxa" w:w="100"/>
+              <w:bottom w:type="dxa" w:w="60"/>
+              <w:right w:type="dxa" w:w="100"/>
+            </w:tcMar>
+          </w:tcPr>
+          <w:p>
+            <w:pPr>
+              <w:spacing w:after="20" w:line="270"/>
+            </w:pPr>
+            <w:r>
+              <w:rPr>
+                <w:rFonts w:ascii="Arial" w:cs="Nirmala UI" w:eastAsia="Yu Gothic" w:hAnsi="Arial"/>
+                <w:b/>
+                <w:bCs/>
+                <w:sz w:val="19"/>
+                <w:szCs w:val="19"/>
+              </w:rPr>
+              <w:t xml:space="preserve">What it shows</w:t>
+            </w:r>
+          </w:p>
+        </w:tc>
+      </w:tr>
+      <w:tr>
+        <w:trPr>
+          <w:tblHeader w:val="false"/>
+        </w:trPr>
+        <w:tc>
+          <w:tcPr>
+            <w:tcW w:type="dxa" w:w="2200"/>
+            <w:tcMar>
+              <w:top w:type="dxa" w:w="60"/>
+              <w:left w:type="dxa" w:w="100"/>
+              <w:bottom w:type="dxa" w:w="60"/>
+              <w:right w:type="dxa" w:w="100"/>
+            </w:tcMar>
+          </w:tcPr>
+          <w:p>
+            <w:pPr>
+              <w:spacing w:after="20" w:line="270"/>
+            </w:pPr>
+            <w:r>
+              <w:rPr>
+                <w:rFonts w:ascii="Arial" w:cs="Nirmala UI" w:eastAsia="Yu Gothic" w:hAnsi="Arial"/>
+                <w:b w:val="false"/>
+                <w:bCs w:val="false"/>
+                <w:sz w:val="19"/>
+                <w:szCs w:val="19"/>
+              </w:rPr>
+              <w:t xml:space="preserve">Today</w:t>
+            </w:r>
+          </w:p>
+        </w:tc>
+        <w:tc>
+          <w:tcPr>
+            <w:tcW w:type="dxa" w:w="7160"/>
+            <w:tcMar>
+              <w:top w:type="dxa" w:w="60"/>
+              <w:left w:type="dxa" w:w="100"/>
+              <w:bottom w:type="dxa" w:w="60"/>
+              <w:right w:type="dxa" w:w="100"/>
+            </w:tcMar>
+          </w:tcPr>
+          <w:p>
+            <w:pPr>
+              <w:spacing w:after="20" w:line="270"/>
+            </w:pPr>
+            <w:r>
+              <w:rPr>
+                <w:rFonts w:ascii="Arial" w:cs="Nirmala UI" w:eastAsia="Yu Gothic" w:hAnsi="Arial"/>
+                <w:b w:val="false"/>
+                <w:bCs w:val="false"/>
+                <w:sz w:val="19"/>
+                <w:szCs w:val="19"/>
+              </w:rPr>
+              <w:t xml:space="preserve">Whether today's entry is done, the latest water level, and "now" and "next" in the schedule. The three first steps also appear here.</w:t>
+            </w:r>
+          </w:p>
+        </w:tc>
+      </w:tr>
+      <w:tr>
+        <w:trPr>
+          <w:tblHeader w:val="false"/>
+        </w:trPr>
+        <w:tc>
+          <w:tcPr>
+            <w:tcW w:type="dxa" w:w="2200"/>
+            <w:tcMar>
+              <w:top w:type="dxa" w:w="60"/>
+              <w:left w:type="dxa" w:w="100"/>
+              <w:bottom w:type="dxa" w:w="60"/>
+              <w:right w:type="dxa" w:w="100"/>
+            </w:tcMar>
+          </w:tcPr>
+          <w:p>
+            <w:pPr>
+              <w:spacing w:after="20" w:line="270"/>
+            </w:pPr>
+            <w:r>
+              <w:rPr>
+                <w:rFonts w:ascii="Arial" w:cs="Nirmala UI" w:eastAsia="Yu Gothic" w:hAnsi="Arial"/>
+                <w:b w:val="false"/>
+                <w:bCs w:val="false"/>
+                <w:sz w:val="19"/>
+                <w:szCs w:val="19"/>
+              </w:rPr>
+              <w:t xml:space="preserve">Entry</w:t>
+            </w:r>
+          </w:p>
+        </w:tc>
+        <w:tc>
+          <w:tcPr>
+            <w:tcW w:type="dxa" w:w="7160"/>
+            <w:tcMar>
+              <w:top w:type="dxa" w:w="60"/>
+              <w:left w:type="dxa" w:w="100"/>
+              <w:bottom w:type="dxa" w:w="60"/>
+              <w:right w:type="dxa" w:w="100"/>
+            </w:tcMar>
+          </w:tcPr>
+          <w:p>
+            <w:pPr>
+              <w:spacing w:after="20" w:line="270"/>
+            </w:pPr>
+            <w:r>
+              <w:rPr>
+                <w:rFonts w:ascii="Arial" w:cs="Nirmala UI" w:eastAsia="Yu Gothic" w:hAnsi="Arial"/>
+                <w:b w:val="false"/>
+                <w:bCs w:val="false"/>
+                <w:sz w:val="19"/>
+                <w:szCs w:val="19"/>
+              </w:rPr>
+              <w:t xml:space="preserve">Three parts: Water level (every day), Field records (fertilizer, pesticide, tillers) and TP / b (re-measurement).</w:t>
+            </w:r>
+          </w:p>
+        </w:tc>
+      </w:tr>
+      <w:tr>
+        <w:trPr>
+          <w:tblHeader w:val="false"/>
+        </w:trPr>
+        <w:tc>
+          <w:tcPr>
+            <w:tcW w:type="dxa" w:w="2200"/>
+            <w:tcMar>
+              <w:top w:type="dxa" w:w="60"/>
+              <w:left w:type="dxa" w:w="100"/>
+              <w:bottom w:type="dxa" w:w="60"/>
+              <w:right w:type="dxa" w:w="100"/>
+            </w:tcMar>
+          </w:tcPr>
+          <w:p>
+            <w:pPr>
+              <w:spacing w:after="20" w:line="270"/>
+            </w:pPr>
+            <w:r>
+              <w:rPr>
+                <w:rFonts w:ascii="Arial" w:cs="Nirmala UI" w:eastAsia="Yu Gothic" w:hAnsi="Arial"/>
+                <w:b w:val="false"/>
+                <w:bCs w:val="false"/>
+                <w:sz w:val="19"/>
+                <w:szCs w:val="19"/>
+              </w:rPr>
+              <w:t xml:space="preserve">Graphs</w:t>
+            </w:r>
+          </w:p>
+        </w:tc>
+        <w:tc>
+          <w:tcPr>
+            <w:tcW w:type="dxa" w:w="7160"/>
+            <w:tcMar>
+              <w:top w:type="dxa" w:w="60"/>
+              <w:left w:type="dxa" w:w="100"/>
+              <w:bottom w:type="dxa" w:w="60"/>
+              <w:right w:type="dxa" w:w="100"/>
+            </w:tcMar>
+          </w:tcPr>
+          <w:p>
+            <w:pPr>
+              <w:spacing w:after="20" w:line="270"/>
+            </w:pPr>
+            <w:r>
+              <w:rPr>
+                <w:rFonts w:ascii="Arial" w:cs="Nirmala UI" w:eastAsia="Yu Gothic" w:hAnsi="Arial"/>
+                <w:b w:val="false"/>
+                <w:bCs w:val="false"/>
+                <w:sz w:val="19"/>
+                <w:szCs w:val="19"/>
+              </w:rPr>
+              <w:t xml:space="preserve">Graphs of water level, irrigation and saving of your ATI.</w:t>
+            </w:r>
+          </w:p>
+        </w:tc>
+      </w:tr>
+      <w:tr>
+        <w:trPr>
+          <w:tblHeader w:val="false"/>
+        </w:trPr>
+        <w:tc>
+          <w:tcPr>
+            <w:tcW w:type="dxa" w:w="2200"/>
+            <w:tcMar>
+              <w:top w:type="dxa" w:w="60"/>
+              <w:left w:type="dxa" w:w="100"/>
+              <w:bottom w:type="dxa" w:w="60"/>
+              <w:right w:type="dxa" w:w="100"/>
+            </w:tcMar>
+          </w:tcPr>
+          <w:p>
+            <w:pPr>
+              <w:spacing w:after="20" w:line="270"/>
+            </w:pPr>
+            <w:r>
+              <w:rPr>
+                <w:rFonts w:ascii="Arial" w:cs="Nirmala UI" w:eastAsia="Yu Gothic" w:hAnsi="Arial"/>
+                <w:b w:val="false"/>
+                <w:bCs w:val="false"/>
+                <w:sz w:val="19"/>
+                <w:szCs w:val="19"/>
+              </w:rPr>
+              <w:t xml:space="preserve">Compare</w:t>
+            </w:r>
+          </w:p>
+        </w:tc>
+        <w:tc>
+          <w:tcPr>
+            <w:tcW w:type="dxa" w:w="7160"/>
+            <w:tcMar>
+              <w:top w:type="dxa" w:w="60"/>
+              <w:left w:type="dxa" w:w="100"/>
+              <w:bottom w:type="dxa" w:w="60"/>
+              <w:right w:type="dxa" w:w="100"/>
+            </w:tcMar>
+          </w:tcPr>
+          <w:p>
+            <w:pPr>
+              <w:spacing w:after="20" w:line="270"/>
+            </w:pPr>
+            <w:r>
+              <w:rPr>
+                <w:rFonts w:ascii="Arial" w:cs="Nirmala UI" w:eastAsia="Yu Gothic" w:hAnsi="Arial"/>
+                <w:b w:val="false"/>
+                <w:bCs w:val="false"/>
+                <w:sz w:val="19"/>
+                <w:szCs w:val="19"/>
+              </w:rPr>
+              <w:t xml:space="preserve">Comparison with the other ATIs in the sheet.</w:t>
+            </w:r>
+          </w:p>
+        </w:tc>
+      </w:tr>
+      <w:tr>
+        <w:trPr>
+          <w:tblHeader w:val="false"/>
+        </w:trPr>
+        <w:tc>
+          <w:tcPr>
+            <w:tcW w:type="dxa" w:w="2200"/>
+            <w:tcMar>
+              <w:top w:type="dxa" w:w="60"/>
+              <w:left w:type="dxa" w:w="100"/>
+              <w:bottom w:type="dxa" w:w="60"/>
+              <w:right w:type="dxa" w:w="100"/>
+            </w:tcMar>
+          </w:tcPr>
+          <w:p>
+            <w:pPr>
+              <w:spacing w:after="20" w:line="270"/>
+            </w:pPr>
+            <w:r>
+              <w:rPr>
+                <w:rFonts w:ascii="Arial" w:cs="Nirmala UI" w:eastAsia="Yu Gothic" w:hAnsi="Arial"/>
+                <w:b w:val="false"/>
+                <w:bCs w:val="false"/>
+                <w:sz w:val="19"/>
+                <w:szCs w:val="19"/>
+              </w:rPr>
+              <w:t xml:space="preserve">More</w:t>
+            </w:r>
+          </w:p>
+        </w:tc>
+        <w:tc>
+          <w:tcPr>
+            <w:tcW w:type="dxa" w:w="7160"/>
+            <w:tcMar>
+              <w:top w:type="dxa" w:w="60"/>
+              <w:left w:type="dxa" w:w="100"/>
+              <w:bottom w:type="dxa" w:w="60"/>
+              <w:right w:type="dxa" w:w="100"/>
+            </w:tcMar>
+          </w:tcPr>
+          <w:p>
+            <w:pPr>
+              <w:spacing w:after="20" w:line="270"/>
+            </w:pPr>
+            <w:r>
+              <w:rPr>
+                <w:rFonts w:ascii="Arial" w:cs="Nirmala UI" w:eastAsia="Yu Gothic" w:hAnsi="Arial"/>
+                <w:b w:val="false"/>
+                <w:bCs w:val="false"/>
+                <w:sz w:val="19"/>
+                <w:szCs w:val="19"/>
+              </w:rPr>
+              <w:t xml:space="preserve">Setup, Schedule, Google Sheet &amp; sharing, Help, For the teacher, demo.</w:t>
+            </w:r>
+          </w:p>
+        </w:tc>
+      </w:tr>
+    </w:tbl>
+    <w:p>
+      <w:pPr>
+        <w:pStyle w:val="Heading2"/>
+        <w:spacing w:after="100" w:before="220"/>
       </w:pPr>
       <w:r>
         <w:rPr>
           <w:rFonts w:ascii="Arial" w:cs="Nirmala UI" w:eastAsia="Yu Gothic" w:hAnsi="Arial"/>
           <w:b/>
           <w:bCs/>
-        </w:rPr>
-        <w:t xml:space="preserve">Setup</w:t>
-      </w:r>
-      <w:r>
-        <w:rPr>
-          <w:rFonts w:ascii="Arial" w:cs="Nirmala UI" w:eastAsia="Yu Gothic" w:hAnsi="Arial"/>
-        </w:rPr>
-        <w:t xml:space="preserve"> tab: enter ATI name*, place*, sowing date*, seedling age at transplanting*, and TP and b* of FP and 3F4D+MD (* = required). While a required item is empty, or the app is not connected to the sheet, "Save entry" in the Entry tab cannot be pressed.</w:t>
+          <w:color w:val="1F4E5F"/>
+          <w:sz w:val="25"/>
+          <w:szCs w:val="25"/>
+        </w:rPr>
+        <w:t xml:space="preserve">3.1 The first time</w:t>
+      </w:r>
+    </w:p>
+    <w:p>
+      <w:pPr>
+        <w:pStyle w:val="ListParagraph"/>
+        <w:numPr>
+          <w:ilvl w:val="0"/>
+          <w:numId w:val="3"/>
+        </w:numPr>
+        <w:spacing w:after="60" w:line="290"/>
+      </w:pPr>
+      <w:r>
+        <w:rPr>
+          <w:rFonts w:ascii="Arial" w:cs="Nirmala UI" w:eastAsia="Yu Gothic" w:hAnsi="Arial"/>
+        </w:rPr>
+        <w:t xml:space="preserve">Open the "class setup link" from the teacher in Chrome on the phone. This connects the app to the shared sheet. In Chrome, choose "Add to Home screen" to start the app from an icon.</w:t>
       </w:r>
     </w:p>
     <w:p>
@@ -648,13 +1002,37 @@
           <w:b/>
           <w:bCs/>
         </w:rPr>
-        <w:t xml:space="preserve">Schedule</w:t>
-      </w:r>
-      <w:r>
-        <w:rPr>
-          <w:rFonts w:ascii="Arial" w:cs="Nirmala UI" w:eastAsia="Yu Gothic" w:hAnsi="Arial"/>
-        </w:rPr>
-        <w:t xml:space="preserve"> tab: planned dates appear automatically. Enter the date you actually did the work in "Actual".</w:t>
+        <w:t xml:space="preserve">More &gt; Setup</w:t>
+      </w:r>
+      <w:r>
+        <w:rPr>
+          <w:rFonts w:ascii="Arial" w:cs="Nirmala UI" w:eastAsia="Yu Gothic" w:hAnsi="Arial"/>
+        </w:rPr>
+        <w:t xml:space="preserve">: enter ATI name*, place*, sowing date*, seedling age at transplanting*, and TP and b* of FP and 3F4D+MD (* = required). While a required item is empty, or the app is not connected to the sheet, "Save entry" in the Entry tab cannot be pressed. The first screen, Today, shows whether these three steps (connect to the sheet, Setup, first entry) are done.</w:t>
+      </w:r>
+    </w:p>
+    <w:p>
+      <w:pPr>
+        <w:pStyle w:val="ListParagraph"/>
+        <w:numPr>
+          <w:ilvl w:val="0"/>
+          <w:numId w:val="3"/>
+        </w:numPr>
+        <w:spacing w:after="60" w:line="290"/>
+      </w:pPr>
+      <w:r>
+        <w:rPr>
+          <w:rFonts w:ascii="Arial" w:cs="Nirmala UI" w:eastAsia="Yu Gothic" w:hAnsi="Arial"/>
+          <w:b/>
+          <w:bCs/>
+        </w:rPr>
+        <w:t xml:space="preserve">More &gt; Schedule</w:t>
+      </w:r>
+      <w:r>
+        <w:rPr>
+          <w:rFonts w:ascii="Arial" w:cs="Nirmala UI" w:eastAsia="Yu Gothic" w:hAnsi="Arial"/>
+        </w:rPr>
+        <w:t xml:space="preserve">: planned dates appear automatically. When you have done the work, open "Enter actual date / change plan" in that row and enter the actual date.</w:t>
       </w:r>
     </w:p>
     <w:p>
@@ -769,13 +1147,13 @@
           <w:b/>
           <w:bCs/>
         </w:rPr>
-        <w:t xml:space="preserve">Entry</w:t>
-      </w:r>
-      <w:r>
-        <w:rPr>
-          <w:rFonts w:ascii="Arial" w:cs="Nirmala UI" w:eastAsia="Yu Gothic" w:hAnsi="Arial"/>
-        </w:rPr>
-        <w:t xml:space="preserve"> tab: choose the date and enter the tape reading (m) of FP and 3F4D+MD. The water level is calculated for you. If you irrigated, choose "Yes" and enter the readings before and after irrigation.</w:t>
+        <w:t xml:space="preserve">Today &gt; Enter today's water level</w:t>
+      </w:r>
+      <w:r>
+        <w:rPr>
+          <w:rFonts w:ascii="Arial" w:cs="Nirmala UI" w:eastAsia="Yu Gothic" w:hAnsi="Arial"/>
+        </w:rPr>
+        <w:t xml:space="preserve"> (or Entry &gt; Water level): enter the tape reading (m) of FP and 3F4D+MD. The water level (for example −2.5 cm, below the soil surface) appears at once under the box. The − and + buttons change m by 0.1 (starting from the last value when the box is empty). If you irrigated, choose "Yes" and enter the readings before and after irrigation; the irrigation (mm) also appears at once.</w:t>
       </w:r>
     </w:p>
     <w:p>
@@ -1122,6 +1500,17 @@
         <w:rPr>
           <w:rFonts w:ascii="Arial" w:cs="Nirmala UI" w:eastAsia="Yu Gothic" w:hAnsi="Arial"/>
         </w:rPr>
+        <w:t xml:space="preserve">You can also keep a photo of the pipe ("Add photo"). Photos stay on that phone only and are not sent to the sheet.</w:t>
+      </w:r>
+    </w:p>
+    <w:p>
+      <w:pPr>
+        <w:spacing w:after="100" w:line="300"/>
+      </w:pPr>
+      <w:r>
+        <w:rPr>
+          <w:rFonts w:ascii="Arial" w:cs="Nirmala UI" w:eastAsia="Yu Gothic" w:hAnsi="Arial"/>
+        </w:rPr>
         <w:t xml:space="preserve">You can enter and save in the field without internet. The data stay on the phone for a while and are written into the sheet when the phone is online again.</w:t>
       </w:r>
     </w:p>
@@ -1573,7 +1962,7 @@
         <w:rPr>
           <w:rFonts w:ascii="Arial" w:cs="Nirmala UI" w:eastAsia="Yu Gothic" w:hAnsi="Arial"/>
         </w:rPr>
-        <w:t xml:space="preserve">Water-level entry: press ✎ in the Entries list, change the values and press "Save entry" again (the same date is overwritten). ✕ deletes the day.</w:t>
+        <w:t xml:space="preserve">Water-level entry: press ✎ in the Entries list under Entry &gt; Water level, change the values and press "Save entry" again (the same date is overwritten). ✕ deletes the day.</w:t>
       </w:r>
     </w:p>
     <w:p>
@@ -1589,7 +1978,7 @@
         <w:rPr>
           <w:rFonts w:ascii="Arial" w:cs="Nirmala UI" w:eastAsia="Yu Gothic" w:hAnsi="Arial"/>
         </w:rPr>
-        <w:t xml:space="preserve">Fertilizer, pesticide, tillers, TP and b: press ✎ in the list, change the values and press "Update". Press "Cancel" to stop.</w:t>
+        <w:t xml:space="preserve">Fertilizer, pesticide, tillers (Entry &gt; Field records), TP and b (Entry &gt; TP / b): press ✎ in the list, change the values and press "Update". Press "Cancel" to stop.</w:t>
       </w:r>
     </w:p>
     <w:p>
@@ -1638,7 +2027,7 @@
         <w:rPr>
           <w:rFonts w:ascii="Arial" w:cs="Nirmala UI" w:eastAsia="Yu Gothic" w:hAnsi="Arial"/>
         </w:rPr>
-        <w:t xml:space="preserve">Open the class setup link. In Share &gt; Restore from the sheet, type the ATI name (exactly as in the sheet) and press "Restore from sheet". The data in the sheet come back to that phone.</w:t>
+        <w:t xml:space="preserve">Open the class setup link. In More &gt; Google Sheet &amp; sharing &gt; Restore from the sheet, type the ATI name (exactly as in the sheet) and press "Restore from sheet". The data in the sheet come back to that phone.</w:t>
       </w:r>
     </w:p>
     <w:p>
@@ -1735,7 +2124,7 @@
         <w:rPr>
           <w:rFonts w:ascii="Arial" w:cs="Nirmala UI" w:eastAsia="Yu Gothic" w:hAnsi="Arial"/>
         </w:rPr>
-        <w:t xml:space="preserve">To see how Compare looks without connecting to the sheet, use "Try with demo data" in Setup (demo ATIs also appear in Compare). Nothing is sent in the demo.</w:t>
+        <w:t xml:space="preserve">To see how Compare looks without connecting to the sheet, use More &gt; Try with demo data (demo ATIs also appear in Compare). Nothing is sent in the demo.</w:t>
       </w:r>
     </w:p>
     <w:p>
@@ -1776,7 +2165,7 @@
         <w:rPr>
           <w:rFonts w:ascii="Arial" w:cs="Nirmala UI" w:eastAsia="Yu Gothic" w:hAnsi="Arial"/>
         </w:rPr>
-        <w:t xml:space="preserve">"Try with demo data" in Setup opens the app with example data. Nothing is saved or sent. Press "Exit demo" at the top to leave.</w:t>
+        <w:t xml:space="preserve">More &gt; Try with demo data opens the app with example data. Nothing is saved or sent. Press "Exit demo" at the top to leave.</w:t>
       </w:r>
     </w:p>
     <w:p>
@@ -1800,7 +2189,7 @@
         <w:rPr>
           <w:rFonts w:ascii="Arial" w:cs="Nirmala UI" w:eastAsia="Yu Gothic" w:hAnsi="Arial"/>
         </w:rPr>
-        <w:t xml:space="preserve">The master copy is the sheet. The phone also keeps a copy until it has been sent. You may also use "Export file (JSON)" in Share from time to time.</w:t>
+        <w:t xml:space="preserve">The master copy is the sheet. The phone also keeps a copy until it has been sent. You may also use "Export file (JSON)" in More &gt; Google Sheet &amp; sharing from time to time.</w:t>
       </w:r>
     </w:p>
     <w:p>
@@ -1824,7 +2213,7 @@
         <w:rPr>
           <w:rFonts w:ascii="Arial" w:cs="Nirmala UI" w:eastAsia="Yu Gothic" w:hAnsi="Arial"/>
         </w:rPr>
-        <w:t xml:space="preserve">"Create link" in Share makes a link that shows only the dashboard.</w:t>
+        <w:t xml:space="preserve">"Create link" in More &gt; Google Sheet &amp; sharing makes a link that shows only the graphs.</w:t>
       </w:r>
     </w:p>
     <w:p>

</xml_diff>

<commit_message>
Rename ATI to Site, teacher to administrator, students to users; app name 3F4D Water Monitor
Co-Authored-By: Claude Opus 5.5 <noreply@anthropic.com>
Claude-Session: https://claude.ai/code/session_01M3YQQoTMjJVd24svSbk5Ra
</commit_message>
<xml_diff>
--- a/manual/ATI_Monitor_App_Manual_EN.docx
+++ b/manual/ATI_Monitor_App_Manual_EN.docx
@@ -15,7 +15,7 @@
           <w:sz w:val="40"/>
           <w:szCs w:val="40"/>
         </w:rPr>
-        <w:t xml:space="preserve">ATI Water Monitor App: User Manual</w:t>
+        <w:t xml:space="preserve">3F4D Water Monitor App: User Manual</w:t>
       </w:r>
     </w:p>
     <w:p>
@@ -32,7 +32,7 @@
           <w:sz w:val="22"/>
           <w:szCs w:val="22"/>
         </w:rPr>
-        <w:t xml:space="preserve">Entry, automatic calculation, automatic writing to the Google Sheet and comparison with other ATIs</w:t>
+        <w:t xml:space="preserve">Entry, automatic calculation, automatic writing to the Google Sheet and comparison with other sites</w:t>
       </w:r>
     </w:p>
     <w:p>
@@ -60,7 +60,7 @@
         <w:rPr>
           <w:rFonts w:ascii="Arial" w:cs="Nirmala UI" w:eastAsia="Yu Gothic" w:hAnsi="Arial"/>
         </w:rPr>
-        <w:t xml:space="preserve">ATI Water Monitor is a smartphone app for recording the water level of the FP (Farmers' Practice) plot and the 3F4D+MD plot. When you save, the data are written automatically into the shared Google Sheet prepared by the teacher, through a script in the sheet (Google Apps Script). The dashboard shows the data kept in the sheet, not only the data on the phone. You can compare your ATI with the other ATIs in graphs.</w:t>
+        <w:t xml:space="preserve">3F4D Water Monitor is a smartphone app for recording the water level of the FP (Farmers' Practice) plot and the 3F4D+MD plot. When you save, the data are written automatically into the shared Google Sheet prepared by the administrator, through a script in the sheet (Google Apps Script). The dashboard shows the data kept in the sheet, not only the data on the phone. You can compare your site with the other sites in graphs.</w:t>
       </w:r>
     </w:p>
     <w:tbl>
@@ -304,7 +304,7 @@
                 <w:sz w:val="19"/>
                 <w:szCs w:val="19"/>
               </w:rPr>
-              <w:t xml:space="preserve">Graphs and Compare show the data in the sheet. You can compare your ATI with the other ATIs in graphs.</w:t>
+              <w:t xml:space="preserve">Graphs and Compare show the data in the sheet. You can compare your site with the other sites in graphs.</w:t>
             </w:r>
           </w:p>
         </w:tc>
@@ -335,7 +335,7 @@
           <w:sz w:val="30"/>
           <w:szCs w:val="30"/>
         </w:rPr>
-        <w:t xml:space="preserve">2. Teacher setup (Excel template and sheet script)</w:t>
+        <w:t xml:space="preserve">2. Administrator setup (Excel template and sheet script)</w:t>
       </w:r>
     </w:p>
     <w:p>
@@ -346,7 +346,7 @@
         <w:rPr>
           <w:rFonts w:ascii="Arial" w:cs="Nirmala UI" w:eastAsia="Yu Gothic" w:hAnsi="Arial"/>
         </w:rPr>
-        <w:t xml:space="preserve">The administrator (for example a teacher) does this once. All ATIs that want to compare use the same sheet.</w:t>
+        <w:t xml:space="preserve">The administrator (for example a teacher, or a staff member of an NGO or SAAO) does this once. All sites that want to compare use the same sheet.</w:t>
       </w:r>
     </w:p>
     <w:p>
@@ -370,7 +370,7 @@
         <w:rPr>
           <w:rFonts w:ascii="Arial" w:cs="Nirmala UI" w:eastAsia="Yu Gothic" w:hAnsi="Arial"/>
         </w:rPr>
-        <w:t xml:space="preserve">: in the app, open More &gt; For the teacher and download the template ATI_Monitor_Shared_TEMPLATE.xlsx with "Excel template". Upload it to Google Drive, open it and choose "File &gt; Save as Google Sheets".</w:t>
+        <w:t xml:space="preserve">: in the app, open More &gt; For the administrator and download the template ATI_Monitor_Shared_TEMPLATE.xlsx with "Excel template". Upload it to Google Drive, open it and choose "File &gt; Save as Google Sheets".</w:t>
       </w:r>
     </w:p>
     <w:p>
@@ -394,7 +394,7 @@
         <w:rPr>
           <w:rFonts w:ascii="Arial" w:cs="Nirmala UI" w:eastAsia="Yu Gothic" w:hAnsi="Arial"/>
         </w:rPr>
-        <w:t xml:space="preserve">: in the sheet open "Extensions &gt; Apps Script". Delete the sample code that is already there, paste the script and press Save (the disk icon). You can copy the script with "Copy script" in the app (More &gt; For the teacher); "Download script (.gs)" gives the file.</w:t>
+        <w:t xml:space="preserve">: in the sheet open "Extensions &gt; Apps Script". Delete the sample code that is already there, paste the script and press Save (the disk icon). You can copy the script with "Copy script" in the app (More &gt; For the administrator); "Download script (.gs)" gives the file.</w:t>
       </w:r>
     </w:p>
     <w:p>
@@ -458,7 +458,7 @@
         <w:rPr>
           <w:rFonts w:ascii="Arial" w:cs="Nirmala UI" w:eastAsia="Yu Gothic" w:hAnsi="Arial"/>
         </w:rPr>
-        <w:t xml:space="preserve">: when the deployment is done, a URL ending in "/exec" is shown. Copy it. (To see it later, use the sheet menu "ATI Monitor &gt; Show web app URL".)</w:t>
+        <w:t xml:space="preserve">: when the deployment is done, a URL ending in "/exec" is shown. Copy it. (To see it later, use the sheet menu "3F4D Monitor &gt; Show web app URL".)</w:t>
       </w:r>
     </w:p>
     <w:p>
@@ -482,7 +482,7 @@
         <w:rPr>
           <w:rFonts w:ascii="Arial" w:cs="Nirmala UI" w:eastAsia="Yu Gothic" w:hAnsi="Arial"/>
         </w:rPr>
-        <w:t xml:space="preserve">: in the app, open More &gt; For the teacher and paste the URL into "Web app URL". Press "Test connection" and check that it says "Connected". Press "Create class setup link" to make one link, and send that link to the students. When a student opens it, the URL is filled in automatically.</w:t>
+        <w:t xml:space="preserve">: in the app, open More &gt; For the administrator and paste the URL into "Web app URL". Press "Test connection" and check that it says "Connected". Press "Create setup link" to make one link, and send that link to the users. When a user opens it, the URL is filled in automatically.</w:t>
       </w:r>
     </w:p>
     <w:tbl>
@@ -534,7 +534,7 @@
               <w:rPr>
                 <w:rFonts w:ascii="Arial" w:cs="Nirmala UI" w:eastAsia="Yu Gothic" w:hAnsi="Arial"/>
               </w:rPr>
-              <w:t xml:space="preserve">Anyone who knows the URL can write data, so give the URL and the class setup link to the students only. If data are deleted by mistake, restore them with "File &gt; Version history". If you change the script, update it with "Deploy &gt; Manage deployments &gt; Edit &gt; New version".</w:t>
+              <w:t xml:space="preserve">Anyone who knows the URL can write data, so give the URL and the setup link to the users only. If data are deleted by mistake, restore them with "File &gt; Version history". If you change the script, update it with "Deploy &gt; Manage deployments &gt; Edit &gt; New version".</w:t>
             </w:r>
           </w:p>
         </w:tc>
@@ -556,7 +556,7 @@
         <w:rPr>
           <w:rFonts w:ascii="Arial" w:cs="Nirmala UI" w:eastAsia="Yu Gothic" w:hAnsi="Arial"/>
         </w:rPr>
-        <w:t xml:space="preserve">On every save, the rows of that ATI are replaced (the sheet does not keep growing). The tab "Data" lists the daily results in a readable form, the tab "ATIs" has one summary row per ATI, and "_Store" is a hidden tab used by the app. The script fills them in. Do not edit them by hand, and do not change the header rows or the tab names.</w:t>
+        <w:t xml:space="preserve">On every save, the rows of that site are replaced (the sheet does not keep growing). The tab "Data" lists the daily results in a readable form, the tab "Sites" has one summary row per site, and "_Store" is a hidden tab used by the app. The script fills them in. Do not edit them by hand, and do not change the header rows or the tab names.</w:t>
       </w:r>
     </w:p>
     <w:p>
@@ -573,7 +573,7 @@
           <w:sz w:val="30"/>
           <w:szCs w:val="30"/>
         </w:rPr>
-        <w:t xml:space="preserve">3. How students use it</w:t>
+        <w:t xml:space="preserve">3. How users use it</w:t>
       </w:r>
     </w:p>
     <w:p>
@@ -834,7 +834,7 @@
                 <w:sz w:val="19"/>
                 <w:szCs w:val="19"/>
               </w:rPr>
-              <w:t xml:space="preserve">Graphs of water level, irrigation and saving of your ATI.</w:t>
+              <w:t xml:space="preserve">Graphs of water level, irrigation and saving of your site.</w:t>
             </w:r>
           </w:p>
         </w:tc>
@@ -891,7 +891,7 @@
                 <w:sz w:val="19"/>
                 <w:szCs w:val="19"/>
               </w:rPr>
-              <w:t xml:space="preserve">Comparison with the other ATIs in the sheet.</w:t>
+              <w:t xml:space="preserve">Comparison with the other sites in the sheet.</w:t>
             </w:r>
           </w:p>
         </w:tc>
@@ -948,7 +948,7 @@
                 <w:sz w:val="19"/>
                 <w:szCs w:val="19"/>
               </w:rPr>
-              <w:t xml:space="preserve">Setup, Schedule, Google Sheet &amp; sharing, Help, For the teacher, demo.</w:t>
+              <w:t xml:space="preserve">Setup, Schedule, Google Sheet &amp; sharing, Help, For the administrator, demo.</w:t>
             </w:r>
           </w:p>
         </w:tc>
@@ -984,7 +984,7 @@
         <w:rPr>
           <w:rFonts w:ascii="Arial" w:cs="Nirmala UI" w:eastAsia="Yu Gothic" w:hAnsi="Arial"/>
         </w:rPr>
-        <w:t xml:space="preserve">Open the "class setup link" from the teacher in Chrome on the phone. This connects the app to the shared sheet. In Chrome, choose "Add to Home screen" to start the app from an icon.</w:t>
+        <w:t xml:space="preserve">Open the "setup link" from the administrator in Chrome on the phone. This connects the app to the shared sheet. In Chrome, choose "Add to Home screen" to start the app from an icon.</w:t>
       </w:r>
     </w:p>
     <w:p>
@@ -1008,7 +1008,7 @@
         <w:rPr>
           <w:rFonts w:ascii="Arial" w:cs="Nirmala UI" w:eastAsia="Yu Gothic" w:hAnsi="Arial"/>
         </w:rPr>
-        <w:t xml:space="preserve">: enter ATI name*, place*, sowing date*, seedling age at transplanting*, and TP and b* of FP and 3F4D+MD (* = required). While a required item is empty, or the app is not connected to the sheet, "Save entry" in the Entry tab cannot be pressed. The first screen, Today, shows whether these three steps (connect to the sheet, Setup, first entry) are done.</w:t>
+        <w:t xml:space="preserve">: enter site name*, place*, sowing date*, seedling age at transplanting*, and TP and b* of FP and 3F4D+MD (* = required). While a required item is empty, or the app is not connected to the sheet, "Save entry" in the Entry tab cannot be pressed. The first screen, Today, shows whether these three steps (connect to the sheet, Setup, first entry) are done.</w:t>
       </w:r>
     </w:p>
     <w:p>
@@ -1429,7 +1429,7 @@
                 <w:sz w:val="19"/>
                 <w:szCs w:val="19"/>
               </w:rPr>
-              <w:t xml:space="preserve">No internet, or the sheet does not answer. It is sent again when the connection is back. If this continues, ask the teacher to check the URL and the deployment.</w:t>
+              <w:t xml:space="preserve">No internet, or the sheet does not answer. It is sent again when the connection is back. If this continues, ask the administrator to check the URL and the deployment.</w:t>
             </w:r>
           </w:p>
         </w:tc>
@@ -1486,7 +1486,7 @@
                 <w:sz w:val="19"/>
                 <w:szCs w:val="19"/>
               </w:rPr>
-              <w:t xml:space="preserve">The sheet script did not accept the data. Tell the teacher.</w:t>
+              <w:t xml:space="preserve">The sheet script did not accept the data. Tell the administrator.</w:t>
             </w:r>
           </w:p>
         </w:tc>
@@ -1641,7 +1641,7 @@
                 <w:sz w:val="19"/>
                 <w:szCs w:val="19"/>
               </w:rPr>
-              <w:t xml:space="preserve">ATI name, place, sowing date, seedling age, TP and b (both plots)</w:t>
+              <w:t xml:space="preserve">Site name, place, sowing date, seedling age, TP and b (both plots)</w:t>
             </w:r>
           </w:p>
         </w:tc>
@@ -1994,7 +1994,7 @@
         <w:rPr>
           <w:rFonts w:ascii="Arial" w:cs="Nirmala UI" w:eastAsia="Yu Gothic" w:hAnsi="Arial"/>
         </w:rPr>
-        <w:t xml:space="preserve">After a correction the new version is also sent automatically. In the sheet, the newest version of the same ATI is used.</w:t>
+        <w:t xml:space="preserve">After a correction the new version is also sent automatically. In the sheet, the newest version of the same site is used.</w:t>
       </w:r>
     </w:p>
     <w:p>
@@ -2027,7 +2027,7 @@
         <w:rPr>
           <w:rFonts w:ascii="Arial" w:cs="Nirmala UI" w:eastAsia="Yu Gothic" w:hAnsi="Arial"/>
         </w:rPr>
-        <w:t xml:space="preserve">Open the class setup link. In More &gt; Google Sheet &amp; sharing &gt; Restore from the sheet, type the ATI name (exactly as in the sheet) and press "Restore from sheet". The data in the sheet come back to that phone.</w:t>
+        <w:t xml:space="preserve">Open the setup link. In More &gt; Google Sheet &amp; sharing &gt; Restore from the sheet, type the site name (exactly as in the sheet) and press "Restore from sheet". The data in the sheet come back to that phone.</w:t>
       </w:r>
     </w:p>
     <w:p>
@@ -2044,7 +2044,7 @@
           <w:sz w:val="30"/>
           <w:szCs w:val="30"/>
         </w:rPr>
-        <w:t xml:space="preserve">4. Comparing with other ATIs (Compare tab)</w:t>
+        <w:t xml:space="preserve">4. Comparing with other sites (Compare tab)</w:t>
       </w:r>
     </w:p>
     <w:p>
@@ -2060,7 +2060,7 @@
         <w:rPr>
           <w:rFonts w:ascii="Arial" w:cs="Nirmala UI" w:eastAsia="Yu Gothic" w:hAnsi="Arial"/>
         </w:rPr>
-        <w:t xml:space="preserve">The Compare tab reads all ATIs in the sheet when the app opens (and again every 5 minutes). Press "Refresh from sheet" to read again. Tick the ATIs you want to see.</w:t>
+        <w:t xml:space="preserve">The Compare tab reads all sites in the sheet when the app opens (and again every 5 minutes). Press "Refresh from sheet" to read again. Tick the sites you want to see.</w:t>
       </w:r>
     </w:p>
     <w:p>
@@ -2076,7 +2076,7 @@
         <w:rPr>
           <w:rFonts w:ascii="Arial" w:cs="Nirmala UI" w:eastAsia="Yu Gothic" w:hAnsi="Arial"/>
         </w:rPr>
-        <w:t xml:space="preserve">Your own ATI is drawn with thick lines. The x axis is days after transplanting (DAT).</w:t>
+        <w:t xml:space="preserve">Your own site is drawn with thick lines. The x axis is days after transplanting (DAT).</w:t>
       </w:r>
     </w:p>
     <w:p>
@@ -2108,7 +2108,7 @@
         <w:rPr>
           <w:rFonts w:ascii="Arial" w:cs="Nirmala UI" w:eastAsia="Yu Gothic" w:hAnsi="Arial"/>
         </w:rPr>
-        <w:t xml:space="preserve">"View" switches the display. "Overlay" draws all ATIs in the same graph. "Each ATI" shows a separate panel with water-level and cumulative-irrigation graphs for every ATI. It also works without data of your own (for example when a teacher looks at all ATIs).</w:t>
+        <w:t xml:space="preserve">"View" switches the display. "Overlay" draws all sites in the same graph. "Each site" shows a separate panel with water-level and cumulative-irrigation graphs for every site. It also works without data of your own (for example when an administrator looks at all sites).</w:t>
       </w:r>
     </w:p>
     <w:p>
@@ -2124,7 +2124,7 @@
         <w:rPr>
           <w:rFonts w:ascii="Arial" w:cs="Nirmala UI" w:eastAsia="Yu Gothic" w:hAnsi="Arial"/>
         </w:rPr>
-        <w:t xml:space="preserve">To see how Compare looks without connecting to the sheet, use More &gt; Try with demo data (demo ATIs also appear in Compare). Nothing is sent in the demo.</w:t>
+        <w:t xml:space="preserve">To see how Compare looks without connecting to the sheet, use More &gt; Try with demo data (demo sites also appear in Compare). Nothing is sent in the demo.</w:t>
       </w:r>
     </w:p>
     <w:p>
@@ -2270,7 +2270,7 @@
         <w:rPr>
           <w:rFonts w:ascii="Arial" w:cs="Nirmala UI" w:eastAsia="Yu Gothic" w:hAnsi="Arial"/>
         </w:rPr>
-        <w:t xml:space="preserve">Each ATI name must be unique. The same name is treated as the same ATI.</w:t>
+        <w:t xml:space="preserve">Each site name must be unique. The same name is treated as the same site.</w:t>
       </w:r>
     </w:p>
     <w:p>
@@ -2286,7 +2286,7 @@
         <w:rPr>
           <w:rFonts w:ascii="Arial" w:cs="Nirmala UI" w:eastAsia="Yu Gothic" w:hAnsi="Arial"/>
         </w:rPr>
-        <w:t xml:space="preserve">On every save, all data of that ATI are written into the sheet (not a difference). The script fills in the sheet; do not edit it by hand.</w:t>
+        <w:t xml:space="preserve">On every save, all data of that site are written into the sheet (not a difference). The script fills in the sheet; do not edit it by hand.</w:t>
       </w:r>
     </w:p>
     <w:p>
@@ -2302,7 +2302,7 @@
         <w:rPr>
           <w:rFonts w:ascii="Arial" w:cs="Nirmala UI" w:eastAsia="Yu Gothic" w:hAnsi="Arial"/>
         </w:rPr>
-        <w:t xml:space="preserve">If the same ATI is used on two phones, the version saved last is the newest in the sheet. Press Refresh to load the newest before entering data.</w:t>
+        <w:t xml:space="preserve">If the same site is used on two phones, the version saved last is the newest in the sheet. Press Refresh to load the newest before entering data.</w:t>
       </w:r>
     </w:p>
     <w:p>
@@ -2334,7 +2334,7 @@
         <w:rPr>
           <w:rFonts w:ascii="Arial" w:cs="Nirmala UI" w:eastAsia="Yu Gothic" w:hAnsi="Arial"/>
         </w:rPr>
-        <w:t xml:space="preserve">Not verified: a real Google Sheet (the authorization screens, deployment, writing, reading), behaviour on real phones, correctness of the Bengali. Test with the first ATI before handing it out.</w:t>
+        <w:t xml:space="preserve">Not verified: a real Google Sheet (the authorization screens, deployment, writing, reading), behaviour on real phones, correctness of the Bengali. Test with the first site before handing it out.</w:t>
       </w:r>
     </w:p>
     <w:sectPr>
@@ -2402,7 +2402,7 @@
         <w:sz w:val="16"/>
         <w:szCs w:val="16"/>
       </w:rPr>
-      <w:t xml:space="preserve">ATI Water Monitor App  –  </w:t>
+      <w:t xml:space="preserve">3F4D Water Monitor App  –  </w:t>
     </w:r>
     <w:r>
       <w:rPr>

</xml_diff>

<commit_message>
Getting started: add step 0 (administrator prepares the sheet and the script)
Co-Authored-By: Claude Opus 5.5 <noreply@anthropic.com>
Claude-Session: https://claude.ai/code/session_01M3YQQoTMjJVd24svSbk5Ra
</commit_message>
<xml_diff>
--- a/manual/ATI_Monitor_App_Manual_EN.docx
+++ b/manual/ATI_Monitor_App_Manual_EN.docx
@@ -720,7 +720,7 @@
                 <w:sz w:val="19"/>
                 <w:szCs w:val="19"/>
               </w:rPr>
-              <w:t xml:space="preserve">Whether today's entry is done, the latest water level, and "now" and "next" in the schedule. The three first steps also appear here.</w:t>
+              <w:t xml:space="preserve">Whether today's entry is done, the latest water level, and "now" and "next" in the schedule. The first steps (0 to 3) also appear here.</w:t>
             </w:r>
           </w:p>
         </w:tc>
@@ -1008,7 +1008,7 @@
         <w:rPr>
           <w:rFonts w:ascii="Arial" w:cs="Nirmala UI" w:eastAsia="Yu Gothic" w:hAnsi="Arial"/>
         </w:rPr>
-        <w:t xml:space="preserve">: enter site name*, place*, sowing date*, seedling age at transplanting*, and TP and b* of FP and 3F4D+MD (* = required). While a required item is empty, or the app is not connected to the sheet, "Save entry" in the Entry tab cannot be pressed. The first screen, Today, shows whether these three steps (connect to the sheet, Setup, first entry) are done.</w:t>
+        <w:t xml:space="preserve">: enter site name*, place*, sowing date*, seedling age at transplanting*, and TP and b* of FP and 3F4D+MD (* = required). While a required item is empty, or the app is not connected to the sheet, "Save entry" in the Entry tab cannot be pressed. The first screen, Today, shows whether steps 0 to 3 are done (0: the administrator prepares the sheet and the script, 1: connect to the sheet, 2: Setup, 3: first entry).</w:t>
       </w:r>
     </w:p>
     <w:p>

</xml_diff>

<commit_message>
Compare links between sites (read-only), write key in setup link, record-level merge for several users per site
Co-Authored-By: Claude Opus 5.5 <noreply@anthropic.com>
Claude-Session: https://claude.ai/code/session_01M3YQQoTMjJVd24svSbk5Ra
</commit_message>
<xml_diff>
--- a/manual/ATI_Monitor_App_Manual_EN.docx
+++ b/manual/ATI_Monitor_App_Manual_EN.docx
@@ -346,7 +346,7 @@
         <w:rPr>
           <w:rFonts w:ascii="Arial" w:cs="Nirmala UI" w:eastAsia="Yu Gothic" w:hAnsi="Arial"/>
         </w:rPr>
-        <w:t xml:space="preserve">The administrator (for example a teacher, or a staff member of an NGO or SAAO) does this once. All sites that want to compare use the same sheet.</w:t>
+        <w:t xml:space="preserve">The administrator of each site (for example a teacher, or a staff member of an NGO or SAAO) does this once at the start. Each site makes its own sheet.</w:t>
       </w:r>
     </w:p>
     <w:p>
@@ -534,7 +534,7 @@
               <w:rPr>
                 <w:rFonts w:ascii="Arial" w:cs="Nirmala UI" w:eastAsia="Yu Gothic" w:hAnsi="Arial"/>
               </w:rPr>
-              <w:t xml:space="preserve">Anyone who knows the URL can write data, so give the URL and the setup link to the users only. If data are deleted by mistake, restore them with "File &gt; Version history". If you change the script, update it with "Deploy &gt; Manage deployments &gt; Edit &gt; New version".</w:t>
+              <w:t xml:space="preserve">Only phones that opened the setup link (it contains the write key) can write to the sheet. Someone who knows only the URL can read but not write. Give the setup link to the users of your site only. If data are deleted by mistake, restore them with "File &gt; Version history". If you change the script, update it with "Deploy &gt; Manage deployments &gt; Edit &gt; New version". If the key is lost: sheet menu "3F4D Monitor &gt; Reset write key", then make and send a new setup link.</w:t>
             </w:r>
           </w:p>
         </w:tc>
@@ -557,6 +557,98 @@
           <w:rFonts w:ascii="Arial" w:cs="Nirmala UI" w:eastAsia="Yu Gothic" w:hAnsi="Arial"/>
         </w:rPr>
         <w:t xml:space="preserve">On every save, the rows of that site are replaced (the sheet does not keep growing). The tab "Data" lists the daily results in a readable form, the tab "Sites" has one summary row per site, and "_Store" is a hidden tab used by the app. The script fills them in. Do not edit them by hand, and do not change the header rows or the tab names.</w:t>
+      </w:r>
+    </w:p>
+    <w:p>
+      <w:pPr>
+        <w:pStyle w:val="Heading2"/>
+        <w:spacing w:after="100" w:before="220"/>
+      </w:pPr>
+      <w:r>
+        <w:rPr>
+          <w:rFonts w:ascii="Arial" w:cs="Nirmala UI" w:eastAsia="Yu Gothic" w:hAnsi="Arial"/>
+          <w:b/>
+          <w:bCs/>
+          <w:color w:val="1F4E5F"/>
+          <w:sz w:val="25"/>
+          <w:szCs w:val="25"/>
+        </w:rPr>
+        <w:t xml:space="preserve">2.1 Comparing with other sites (compare links)</w:t>
+      </w:r>
+    </w:p>
+    <w:p>
+      <w:pPr>
+        <w:spacing w:after="100" w:line="300"/>
+      </w:pPr>
+      <w:r>
+        <w:rPr>
+          <w:rFonts w:ascii="Arial" w:cs="Nirmala UI" w:eastAsia="Yu Gothic" w:hAnsi="Arial"/>
+        </w:rPr>
+        <w:t xml:space="preserve">Each site uses its own Google Sheet (site A has one administrator and several users, site B another administrator and users, and so on). To compare sites, the administrators exchange "compare links". A compare link lets others read your data; they cannot change it.</w:t>
+      </w:r>
+    </w:p>
+    <w:p>
+      <w:pPr>
+        <w:pStyle w:val="ListParagraph"/>
+        <w:numPr>
+          <w:ilvl w:val="0"/>
+          <w:numId w:val="3"/>
+        </w:numPr>
+        <w:spacing w:after="80" w:line="290"/>
+      </w:pPr>
+      <w:r>
+        <w:rPr>
+          <w:rFonts w:ascii="Arial" w:cs="Nirmala UI" w:eastAsia="Yu Gothic" w:hAnsi="Arial"/>
+          <w:b/>
+          <w:bCs/>
+        </w:rPr>
+        <w:t xml:space="preserve">Make your link</w:t>
+      </w:r>
+      <w:r>
+        <w:rPr>
+          <w:rFonts w:ascii="Arial" w:cs="Nirmala UI" w:eastAsia="Yu Gothic" w:hAnsi="Arial"/>
+        </w:rPr>
+        <w:t xml:space="preserve">: More &gt; For the administrator &gt; Compare with other sites &gt; "Create compare link". Send the link to the administrators of other sites (WhatsApp, e-mail and so on).</w:t>
+      </w:r>
+    </w:p>
+    <w:p>
+      <w:pPr>
+        <w:pStyle w:val="ListParagraph"/>
+        <w:numPr>
+          <w:ilvl w:val="0"/>
+          <w:numId w:val="3"/>
+        </w:numPr>
+        <w:spacing w:after="80" w:line="290"/>
+      </w:pPr>
+      <w:r>
+        <w:rPr>
+          <w:rFonts w:ascii="Arial" w:cs="Nirmala UI" w:eastAsia="Yu Gothic" w:hAnsi="Arial"/>
+          <w:b/>
+          <w:bCs/>
+        </w:rPr>
+        <w:t xml:space="preserve">Add their links</w:t>
+      </w:r>
+      <w:r>
+        <w:rPr>
+          <w:rFonts w:ascii="Arial" w:cs="Nirmala UI" w:eastAsia="Yu Gothic" w:hAnsi="Arial"/>
+        </w:rPr>
+        <w:t xml:space="preserve">: paste a compare link you received into "Add other sites" on the same screen and press "Add site" (or simply open the link). The added sites appear in Compare for every user of your site.</w:t>
+      </w:r>
+    </w:p>
+    <w:p>
+      <w:pPr>
+        <w:pStyle w:val="ListParagraph"/>
+        <w:numPr>
+          <w:ilvl w:val="0"/>
+          <w:numId w:val="3"/>
+        </w:numPr>
+        <w:spacing w:after="80" w:line="290"/>
+      </w:pPr>
+      <w:r>
+        <w:rPr>
+          <w:rFonts w:ascii="Arial" w:cs="Nirmala UI" w:eastAsia="Yu Gothic" w:hAnsi="Arial"/>
+        </w:rPr>
+        <w:t xml:space="preserve">Press ✕ in the list to remove a site. Someone who is not a user of a site (for example a project member) can open a compare link to see Compare on that phone only.</w:t>
       </w:r>
     </w:p>
     <w:p>
@@ -891,7 +983,7 @@
                 <w:sz w:val="19"/>
                 <w:szCs w:val="19"/>
               </w:rPr>
-              <w:t xml:space="preserve">Comparison with the other sites in the sheet.</w:t>
+              <w:t xml:space="preserve">Comparison with the other sites added with compare links.</w:t>
             </w:r>
           </w:p>
         </w:tc>
@@ -976,7 +1068,7 @@
         <w:pStyle w:val="ListParagraph"/>
         <w:numPr>
           <w:ilvl w:val="0"/>
-          <w:numId w:val="3"/>
+          <w:numId w:val="4"/>
         </w:numPr>
         <w:spacing w:after="60" w:line="290"/>
       </w:pPr>
@@ -992,7 +1084,7 @@
         <w:pStyle w:val="ListParagraph"/>
         <w:numPr>
           <w:ilvl w:val="0"/>
-          <w:numId w:val="3"/>
+          <w:numId w:val="4"/>
         </w:numPr>
         <w:spacing w:after="60" w:line="290"/>
       </w:pPr>
@@ -1016,7 +1108,7 @@
         <w:pStyle w:val="ListParagraph"/>
         <w:numPr>
           <w:ilvl w:val="0"/>
-          <w:numId w:val="3"/>
+          <w:numId w:val="4"/>
         </w:numPr>
         <w:spacing w:after="60" w:line="290"/>
       </w:pPr>
@@ -1137,7 +1229,7 @@
         <w:pStyle w:val="ListParagraph"/>
         <w:numPr>
           <w:ilvl w:val="0"/>
-          <w:numId w:val="4"/>
+          <w:numId w:val="5"/>
         </w:numPr>
         <w:spacing w:after="80" w:line="290"/>
       </w:pPr>
@@ -1161,7 +1253,7 @@
         <w:pStyle w:val="ListParagraph"/>
         <w:numPr>
           <w:ilvl w:val="0"/>
-          <w:numId w:val="4"/>
+          <w:numId w:val="5"/>
         </w:numPr>
         <w:spacing w:after="80" w:line="290"/>
       </w:pPr>
@@ -1177,7 +1269,7 @@
         <w:pStyle w:val="ListParagraph"/>
         <w:numPr>
           <w:ilvl w:val="0"/>
-          <w:numId w:val="4"/>
+          <w:numId w:val="5"/>
         </w:numPr>
         <w:spacing w:after="80" w:line="290"/>
       </w:pPr>
@@ -1954,7 +2046,7 @@
         <w:pStyle w:val="ListParagraph"/>
         <w:numPr>
           <w:ilvl w:val="0"/>
-          <w:numId w:val="3"/>
+          <w:numId w:val="4"/>
         </w:numPr>
         <w:spacing w:after="60" w:line="290"/>
       </w:pPr>
@@ -1970,7 +2062,7 @@
         <w:pStyle w:val="ListParagraph"/>
         <w:numPr>
           <w:ilvl w:val="0"/>
-          <w:numId w:val="3"/>
+          <w:numId w:val="4"/>
         </w:numPr>
         <w:spacing w:after="60" w:line="290"/>
       </w:pPr>
@@ -1986,7 +2078,7 @@
         <w:pStyle w:val="ListParagraph"/>
         <w:numPr>
           <w:ilvl w:val="0"/>
-          <w:numId w:val="3"/>
+          <w:numId w:val="4"/>
         </w:numPr>
         <w:spacing w:after="60" w:line="290"/>
       </w:pPr>
@@ -2019,7 +2111,7 @@
         <w:pStyle w:val="ListParagraph"/>
         <w:numPr>
           <w:ilvl w:val="0"/>
-          <w:numId w:val="3"/>
+          <w:numId w:val="4"/>
         </w:numPr>
         <w:spacing w:after="60" w:line="290"/>
       </w:pPr>
@@ -2052,7 +2144,7 @@
         <w:pStyle w:val="ListParagraph"/>
         <w:numPr>
           <w:ilvl w:val="0"/>
-          <w:numId w:val="3"/>
+          <w:numId w:val="4"/>
         </w:numPr>
         <w:spacing w:after="60" w:line="290"/>
       </w:pPr>
@@ -2060,15 +2152,15 @@
         <w:rPr>
           <w:rFonts w:ascii="Arial" w:cs="Nirmala UI" w:eastAsia="Yu Gothic" w:hAnsi="Arial"/>
         </w:rPr>
-        <w:t xml:space="preserve">The Compare tab reads all sites in the sheet when the app opens (and again every 5 minutes). Press "Refresh from sheet" to read again. Tick the sites you want to see.</w:t>
-      </w:r>
-    </w:p>
-    <w:p>
-      <w:pPr>
-        <w:pStyle w:val="ListParagraph"/>
-        <w:numPr>
-          <w:ilvl w:val="0"/>
-          <w:numId w:val="3"/>
+        <w:t xml:space="preserve">The Compare tab reads your site and the other sites that your administrator added with compare links when the app opens (and again every 5 minutes). Press "Refresh from sheet" to read again. Tick the sites you want to see.</w:t>
+      </w:r>
+    </w:p>
+    <w:p>
+      <w:pPr>
+        <w:pStyle w:val="ListParagraph"/>
+        <w:numPr>
+          <w:ilvl w:val="0"/>
+          <w:numId w:val="4"/>
         </w:numPr>
         <w:spacing w:after="60" w:line="290"/>
       </w:pPr>
@@ -2084,7 +2176,7 @@
         <w:pStyle w:val="ListParagraph"/>
         <w:numPr>
           <w:ilvl w:val="0"/>
-          <w:numId w:val="3"/>
+          <w:numId w:val="4"/>
         </w:numPr>
         <w:spacing w:after="60" w:line="290"/>
       </w:pPr>
@@ -2100,7 +2192,7 @@
         <w:pStyle w:val="ListParagraph"/>
         <w:numPr>
           <w:ilvl w:val="0"/>
-          <w:numId w:val="3"/>
+          <w:numId w:val="4"/>
         </w:numPr>
         <w:spacing w:after="60" w:line="290"/>
       </w:pPr>
@@ -2116,7 +2208,7 @@
         <w:pStyle w:val="ListParagraph"/>
         <w:numPr>
           <w:ilvl w:val="0"/>
-          <w:numId w:val="3"/>
+          <w:numId w:val="4"/>
         </w:numPr>
         <w:spacing w:after="60" w:line="290"/>
       </w:pPr>
@@ -2149,7 +2241,7 @@
         <w:pStyle w:val="ListParagraph"/>
         <w:numPr>
           <w:ilvl w:val="0"/>
-          <w:numId w:val="3"/>
+          <w:numId w:val="4"/>
         </w:numPr>
         <w:spacing w:after="60" w:line="290"/>
       </w:pPr>
@@ -2173,7 +2265,7 @@
         <w:pStyle w:val="ListParagraph"/>
         <w:numPr>
           <w:ilvl w:val="0"/>
-          <w:numId w:val="3"/>
+          <w:numId w:val="4"/>
         </w:numPr>
         <w:spacing w:after="60" w:line="290"/>
       </w:pPr>
@@ -2197,7 +2289,7 @@
         <w:pStyle w:val="ListParagraph"/>
         <w:numPr>
           <w:ilvl w:val="0"/>
-          <w:numId w:val="3"/>
+          <w:numId w:val="4"/>
         </w:numPr>
         <w:spacing w:after="60" w:line="290"/>
       </w:pPr>
@@ -2221,7 +2313,7 @@
         <w:pStyle w:val="ListParagraph"/>
         <w:numPr>
           <w:ilvl w:val="0"/>
-          <w:numId w:val="3"/>
+          <w:numId w:val="4"/>
         </w:numPr>
         <w:spacing w:after="60" w:line="290"/>
       </w:pPr>
@@ -2262,7 +2354,7 @@
         <w:pStyle w:val="ListParagraph"/>
         <w:numPr>
           <w:ilvl w:val="0"/>
-          <w:numId w:val="3"/>
+          <w:numId w:val="4"/>
         </w:numPr>
         <w:spacing w:after="60" w:line="290"/>
       </w:pPr>
@@ -2278,7 +2370,7 @@
         <w:pStyle w:val="ListParagraph"/>
         <w:numPr>
           <w:ilvl w:val="0"/>
-          <w:numId w:val="3"/>
+          <w:numId w:val="4"/>
         </w:numPr>
         <w:spacing w:after="60" w:line="290"/>
       </w:pPr>
@@ -2294,7 +2386,7 @@
         <w:pStyle w:val="ListParagraph"/>
         <w:numPr>
           <w:ilvl w:val="0"/>
-          <w:numId w:val="3"/>
+          <w:numId w:val="4"/>
         </w:numPr>
         <w:spacing w:after="60" w:line="290"/>
       </w:pPr>
@@ -2302,15 +2394,15 @@
         <w:rPr>
           <w:rFonts w:ascii="Arial" w:cs="Nirmala UI" w:eastAsia="Yu Gothic" w:hAnsi="Arial"/>
         </w:rPr>
-        <w:t xml:space="preserve">If the same site is used on two phones, the version saved last is the newest in the sheet. Press Refresh to load the newest before entering data.</w:t>
-      </w:r>
-    </w:p>
-    <w:p>
-      <w:pPr>
-        <w:pStyle w:val="ListParagraph"/>
-        <w:numPr>
-          <w:ilvl w:val="0"/>
-          <w:numId w:val="3"/>
+        <w:t xml:space="preserve">Several people may enter data for one site on different phones. On every save the app merges with the sheet record by record (if two people change the same day, the later change is kept; a deleted record is deleted on the other phones too).</w:t>
+      </w:r>
+    </w:p>
+    <w:p>
+      <w:pPr>
+        <w:pStyle w:val="ListParagraph"/>
+        <w:numPr>
+          <w:ilvl w:val="0"/>
+          <w:numId w:val="4"/>
         </w:numPr>
         <w:spacing w:after="60" w:line="290"/>
       </w:pPr>
@@ -2326,7 +2418,7 @@
         <w:pStyle w:val="ListParagraph"/>
         <w:numPr>
           <w:ilvl w:val="0"/>
-          <w:numId w:val="3"/>
+          <w:numId w:val="4"/>
         </w:numPr>
         <w:spacing w:after="60" w:line="290"/>
       </w:pPr>
@@ -2685,12 +2777,18 @@
     </w:lvlOverride>
   </w:num>
   <w:num w:numId="3">
+    <w:abstractNumId w:val="7"/>
+    <w:lvlOverride w:ilvl="0">
+      <w:startOverride w:val="1"/>
+    </w:lvlOverride>
+  </w:num>
+  <w:num w:numId="4">
     <w:abstractNumId w:val="2"/>
     <w:lvlOverride w:ilvl="0">
       <w:startOverride w:val="1"/>
     </w:lvlOverride>
   </w:num>
-  <w:num w:numId="4">
+  <w:num w:numId="5">
     <w:abstractNumId w:val="5"/>
     <w:lvlOverride w:ilvl="0">
       <w:startOverride w:val="1"/>

</xml_diff>

<commit_message>
Add sheet-only version (Google Sheets, formulas only) with template and demo
Co-Authored-By: Claude Opus 5.5 <noreply@anthropic.com>
Claude-Session: https://claude.ai/code/session_01M3YQQoTMjJVd24svSbk5Ra
</commit_message>
<xml_diff>
--- a/manual/ATI_Monitor_App_Manual_EN.docx
+++ b/manual/ATI_Monitor_App_Manual_EN.docx
@@ -2429,6 +2429,98 @@
         <w:t xml:space="preserve">Not verified: a real Google Sheet (the authorization screens, deployment, writing, reading), behaviour on real phones, correctness of the Bengali. Test with the first site before handing it out.</w:t>
       </w:r>
     </w:p>
+    <w:p>
+      <w:pPr>
+        <w:pStyle w:val="Heading1"/>
+        <w:spacing w:after="140" w:before="320"/>
+      </w:pPr>
+      <w:r>
+        <w:rPr>
+          <w:rFonts w:ascii="Arial" w:cs="Nirmala UI" w:eastAsia="Yu Gothic" w:hAnsi="Arial"/>
+          <w:b/>
+          <w:bCs/>
+          <w:color w:val="1F4E5F"/>
+          <w:sz w:val="30"/>
+          <w:szCs w:val="30"/>
+        </w:rPr>
+        <w:t xml:space="preserve">7. Sheet-only version (without the app)</w:t>
+      </w:r>
+    </w:p>
+    <w:p>
+      <w:pPr>
+        <w:spacing w:after="100" w:line="300"/>
+      </w:pPr>
+      <w:r>
+        <w:rPr>
+          <w:rFonts w:ascii="Arial" w:cs="Nirmala UI" w:eastAsia="Yu Gothic" w:hAnsi="Arial"/>
+        </w:rPr>
+        <w:t xml:space="preserve">For sites that prefer to enter data directly in a Google Sheet there is a sheet version (More &gt; For the administrator &gt; Sheet-only version). It does the same calculations as the app (water level, irrigation, cumulative irrigation, daily decrease, saving, tillers), the data checks, the schedule and the graphs, with formulas only. No script is needed. It has no comparison between sites.</w:t>
+      </w:r>
+    </w:p>
+    <w:p>
+      <w:pPr>
+        <w:pStyle w:val="ListParagraph"/>
+        <w:numPr>
+          <w:ilvl w:val="0"/>
+          <w:numId w:val="6"/>
+        </w:numPr>
+        <w:spacing w:after="80" w:line="290"/>
+      </w:pPr>
+      <w:r>
+        <w:rPr>
+          <w:rFonts w:ascii="Arial" w:cs="Nirmala UI" w:eastAsia="Yu Gothic" w:hAnsi="Arial"/>
+        </w:rPr>
+        <w:t xml:space="preserve">Download "Sheet version (empty)", upload it to Google Drive and choose "Save as Google Sheets".</w:t>
+      </w:r>
+    </w:p>
+    <w:p>
+      <w:pPr>
+        <w:pStyle w:val="ListParagraph"/>
+        <w:numPr>
+          <w:ilvl w:val="0"/>
+          <w:numId w:val="6"/>
+        </w:numPr>
+        <w:spacing w:after="80" w:line="290"/>
+      </w:pPr>
+      <w:r>
+        <w:rPr>
+          <w:rFonts w:ascii="Arial" w:cs="Nirmala UI" w:eastAsia="Yu Gothic" w:hAnsi="Arial"/>
+        </w:rPr>
+        <w:t xml:space="preserve">Share it as Editor with the users of the site. Each site uses its own copy ("File &gt; Make a copy").</w:t>
+      </w:r>
+    </w:p>
+    <w:p>
+      <w:pPr>
+        <w:pStyle w:val="ListParagraph"/>
+        <w:numPr>
+          <w:ilvl w:val="0"/>
+          <w:numId w:val="6"/>
+        </w:numPr>
+        <w:spacing w:after="80" w:line="290"/>
+      </w:pPr>
+      <w:r>
+        <w:rPr>
+          <w:rFonts w:ascii="Arial" w:cs="Nirmala UI" w:eastAsia="Yu Gothic" w:hAnsi="Arial"/>
+        </w:rPr>
+        <w:t xml:space="preserve">Tabs: Today (state of today, latest water level, next events, totals), Daily (one row per day), Setup, Schedule, TP-b, Fertilizer, Pesticide, Tillers, Graphs, Guide. Enter data in the yellow cells; do not change the grey (calculated) cells. A required cell that is empty turns red.</w:t>
+      </w:r>
+    </w:p>
+    <w:p>
+      <w:pPr>
+        <w:pStyle w:val="ListParagraph"/>
+        <w:numPr>
+          <w:ilvl w:val="0"/>
+          <w:numId w:val="4"/>
+        </w:numPr>
+        <w:spacing w:after="60" w:line="290"/>
+      </w:pPr>
+      <w:r>
+        <w:rPr>
+          <w:rFonts w:ascii="Arial" w:cs="Nirmala UI" w:eastAsia="Yu Gothic" w:hAnsi="Arial"/>
+        </w:rPr>
+        <w:t xml:space="preserve">"Sheet version (with demo data)" is the same sheet with example data. Its calculations were checked against the app (186 demo rows). How the graphs look after conversion to Google Sheets has not been checked yet.</w:t>
+      </w:r>
+    </w:p>
     <w:sectPr>
       <w:footerReference w:type="default" r:id="rId7"/>
       <w:pgSz w:w="11906" w:h="16838" w:orient="portrait"/>
@@ -2790,6 +2882,12 @@
   </w:num>
   <w:num w:numId="5">
     <w:abstractNumId w:val="5"/>
+    <w:lvlOverride w:ilvl="0">
+      <w:startOverride w:val="1"/>
+    </w:lvlOverride>
+  </w:num>
+  <w:num w:numId="6">
+    <w:abstractNumId w:val="8"/>
     <w:lvlOverride w:ilvl="0">
       <w:startOverride w:val="1"/>
     </w:lvlOverride>

</xml_diff>